<commit_message>
feat: antecedentes: cabecalho forcado e paragrafo dos sem condenacao
</commit_message>
<xml_diff>
--- a/scripts/automacao/templates/antecedentes.docx
+++ b/scripts/automacao/templates/antecedentes.docx
@@ -1,6 +1,6 @@
 
 <file path=word/document.xml><?xml version="1.0" encoding="utf-8"?>
-<w:document xmlns:ve="http://schemas.openxmlformats.org/markup-compatibility/2006" xmlns:o="urn:schemas-microsoft-com:office:office" xmlns:r="http://schemas.openxmlformats.org/officeDocument/2006/relationships" xmlns:m="http://schemas.openxmlformats.org/officeDocument/2006/math" xmlns:v="urn:schemas-microsoft-com:vml" xmlns:wp="http://schemas.openxmlformats.org/drawingml/2006/wordprocessingDrawing" xmlns:w10="urn:schemas-microsoft-com:office:word" xmlns:w="http://schemas.openxmlformats.org/wordprocessingml/2006/main" xmlns:wne="http://schemas.microsoft.com/office/word/2006/wordml">
+<w:document xmlns:wpc="http://schemas.microsoft.com/office/word/2010/wordprocessingCanvas" xmlns:cx="http://schemas.microsoft.com/office/drawing/2014/chartex" xmlns:cx1="http://schemas.microsoft.com/office/drawing/2015/9/8/chartex" xmlns:cx2="http://schemas.microsoft.com/office/drawing/2015/10/21/chartex" xmlns:cx3="http://schemas.microsoft.com/office/drawing/2016/5/9/chartex" xmlns:cx4="http://schemas.microsoft.com/office/drawing/2016/5/10/chartex" xmlns:cx5="http://schemas.microsoft.com/office/drawing/2016/5/11/chartex" xmlns:cx6="http://schemas.microsoft.com/office/drawing/2016/5/12/chartex" xmlns:cx7="http://schemas.microsoft.com/office/drawing/2016/5/13/chartex" xmlns:cx8="http://schemas.microsoft.com/office/drawing/2016/5/14/chartex" xmlns:mc="http://schemas.openxmlformats.org/markup-compatibility/2006" xmlns:aink="http://schemas.microsoft.com/office/drawing/2016/ink" xmlns:am3d="http://schemas.microsoft.com/office/drawing/2017/model3d" xmlns:o="urn:schemas-microsoft-com:office:office" xmlns:oel="http://schemas.microsoft.com/office/2019/extlst" xmlns:r="http://schemas.openxmlformats.org/officeDocument/2006/relationships" xmlns:m="http://schemas.openxmlformats.org/officeDocument/2006/math" xmlns:v="urn:schemas-microsoft-com:vml" xmlns:wp14="http://schemas.microsoft.com/office/word/2010/wordprocessingDrawing" xmlns:wp="http://schemas.openxmlformats.org/drawingml/2006/wordprocessingDrawing" xmlns:w10="urn:schemas-microsoft-com:office:word" xmlns:w="http://schemas.openxmlformats.org/wordprocessingml/2006/main" xmlns:w14="http://schemas.microsoft.com/office/word/2010/wordml" xmlns:w15="http://schemas.microsoft.com/office/word/2012/wordml" xmlns:w16cex="http://schemas.microsoft.com/office/word/2018/wordml/cex" xmlns:w16cid="http://schemas.microsoft.com/office/word/2016/wordml/cid" xmlns:w16="http://schemas.microsoft.com/office/word/2018/wordml" xmlns:w16du="http://schemas.microsoft.com/office/word/2023/wordml/word16du" xmlns:w16sdtdh="http://schemas.microsoft.com/office/word/2020/wordml/sdtdatahash" xmlns:w16sdtfl="http://schemas.microsoft.com/office/word/2024/wordml/sdtformatlock" xmlns:w16se="http://schemas.microsoft.com/office/word/2015/wordml/symex" xmlns:wpg="http://schemas.microsoft.com/office/word/2010/wordprocessingGroup" xmlns:wpi="http://schemas.microsoft.com/office/word/2010/wordprocessingInk" xmlns:wne="http://schemas.microsoft.com/office/word/2006/wordml" xmlns:wps="http://schemas.microsoft.com/office/word/2010/wordprocessingShape" mc:Ignorable="w14 w15 w16se w16cid w16 w16cex w16sdtdh w16sdtfl w16du wp14">
   <w:body>
     <w:p>
       <w:pPr>
@@ -26,21 +26,7 @@
         <w:rPr>
           <w:szCs w:val="24"/>
         </w:rPr>
-        <w:t>:</w:t>
-      </w:r>
-      <w:proofErr w:type="gramStart"/>
-      <w:r>
-        <w:rPr>
-          <w:szCs w:val="24"/>
-        </w:rPr>
-        <w:t xml:space="preserve">  </w:t>
-      </w:r>
-      <w:proofErr w:type="gramEnd"/>
-      <w:r>
-        <w:rPr>
-          <w:szCs w:val="24"/>
-        </w:rPr>
-        <w:t>{{processo}}</w:t>
+        <w:t>:  {{processo}}</w:t>
       </w:r>
     </w:p>
     <w:p>
@@ -49,7 +35,6 @@
         <w:spacing w:line="360" w:lineRule="auto"/>
         <w:jc w:val="both"/>
       </w:pPr>
-      <w:proofErr w:type="spellStart"/>
       <w:r>
         <w:rPr>
           <w:rFonts w:ascii="Times New Roman" w:hAnsi="Times New Roman" w:cs="Times New Roman"/>
@@ -59,7 +44,6 @@
         </w:rPr>
         <w:t>Assunto</w:t>
       </w:r>
-      <w:proofErr w:type="spellEnd"/>
       <w:r>
         <w:rPr>
           <w:rFonts w:ascii="Times New Roman" w:hAnsi="Times New Roman" w:cs="Times New Roman"/>
@@ -112,12 +96,6 @@
     <w:p>
       <w:pPr>
         <w:pStyle w:val="Default"/>
-        <w:pBdr>
-          <w:top w:val="single" w:sz="4" w:space="1" w:color="000000"/>
-          <w:left w:val="single" w:sz="4" w:space="4" w:color="000000"/>
-          <w:bottom w:val="single" w:sz="4" w:space="1" w:color="000000"/>
-          <w:right w:val="single" w:sz="4" w:space="4" w:color="000000"/>
-        </w:pBdr>
         <w:jc w:val="center"/>
         <w:rPr>
           <w:rFonts w:ascii="Times New Roman" w:hAnsi="Times New Roman" w:cs="Times New Roman"/>
@@ -126,26 +104,50 @@
           <w:szCs w:val="32"/>
         </w:rPr>
       </w:pPr>
-      <w:r>
+    </w:p>
+    <w:p>
+      <w:pPr>
+        <w:pStyle w:val="Default"/>
+        <w:jc w:val="center"/>
         <w:rPr>
           <w:rFonts w:ascii="Times New Roman" w:hAnsi="Times New Roman" w:cs="Times New Roman"/>
           <w:b/>
           <w:sz w:val="32"/>
           <w:szCs w:val="32"/>
         </w:rPr>
-        <w:t>INFORMAÇÃO INSTRUTIVA</w:t>
-      </w:r>
-    </w:p>
-    <w:p>
-      <w:pPr>
-        <w:pStyle w:val="Default"/>
-        <w:jc w:val="both"/>
+      </w:pPr>
+      <w:r>
         <w:rPr>
           <w:rFonts w:ascii="Times New Roman" w:hAnsi="Times New Roman" w:cs="Times New Roman"/>
           <w:b/>
           <w:sz w:val="32"/>
           <w:szCs w:val="32"/>
         </w:rPr>
+        <w:t>INFORMAÇÃO INSTRUTIVA</w:t>
+      </w:r>
+    </w:p>
+    <w:p>
+      <w:pPr>
+        <w:pStyle w:val="Default"/>
+        <w:jc w:val="center"/>
+        <w:rPr>
+          <w:rFonts w:ascii="Times New Roman" w:hAnsi="Times New Roman" w:cs="Times New Roman"/>
+          <w:b/>
+          <w:sz w:val="32"/>
+          <w:szCs w:val="32"/>
+        </w:rPr>
+      </w:pPr>
+    </w:p>
+    <w:p>
+      <w:pPr>
+        <w:pStyle w:val="Default"/>
+        <w:jc w:val="both"/>
+        <w:rPr>
+          <w:rFonts w:ascii="Times New Roman" w:hAnsi="Times New Roman" w:cs="Times New Roman"/>
+          <w:b/>
+          <w:sz w:val="32"/>
+          <w:szCs w:val="32"/>
+        </w:rPr>
       </w:pPr>
     </w:p>
     <w:p>
@@ -159,37 +161,7 @@
         <w:rPr>
           <w:rFonts w:ascii="Times New Roman" w:hAnsi="Times New Roman" w:cs="Times New Roman"/>
         </w:rPr>
-        <w:t>{%</w:t>
-      </w:r>
-      <w:proofErr w:type="spellStart"/>
-      <w:proofErr w:type="gramStart"/>
-      <w:r>
-        <w:rPr>
-          <w:rFonts w:ascii="Times New Roman" w:hAnsi="Times New Roman" w:cs="Times New Roman"/>
-        </w:rPr>
-        <w:t>if</w:t>
-      </w:r>
-      <w:proofErr w:type="spellEnd"/>
-      <w:proofErr w:type="gramEnd"/>
-      <w:r>
-        <w:rPr>
-          <w:rFonts w:ascii="Times New Roman" w:hAnsi="Times New Roman" w:cs="Times New Roman"/>
-        </w:rPr>
-        <w:t xml:space="preserve"> </w:t>
-      </w:r>
-      <w:proofErr w:type="spellStart"/>
-      <w:r>
-        <w:rPr>
-          <w:rFonts w:ascii="Times New Roman" w:hAnsi="Times New Roman" w:cs="Times New Roman"/>
-        </w:rPr>
-        <w:t>sem_valores</w:t>
-      </w:r>
-      <w:proofErr w:type="spellEnd"/>
-      <w:r>
-        <w:rPr>
-          <w:rFonts w:ascii="Times New Roman" w:hAnsi="Times New Roman" w:cs="Times New Roman"/>
-        </w:rPr>
-        <w:t>%}</w:t>
+        <w:t>{%if sem_valores%}</w:t>
       </w:r>
     </w:p>
     <w:p>
@@ -203,21 +175,7 @@
         <w:rPr>
           <w:rFonts w:ascii="Times New Roman" w:hAnsi="Times New Roman" w:cs="Times New Roman"/>
         </w:rPr>
-        <w:t>Em atenção à solicitação remetida a esta Coordenadoria de Controle de Decisões, informamos que não há condenações envolvendo {{</w:t>
-      </w:r>
-      <w:proofErr w:type="spellStart"/>
-      <w:r>
-        <w:rPr>
-          <w:rFonts w:ascii="Times New Roman" w:hAnsi="Times New Roman" w:cs="Times New Roman"/>
-        </w:rPr>
-        <w:t>responsaveis</w:t>
-      </w:r>
-      <w:proofErr w:type="spellEnd"/>
-      <w:r>
-        <w:rPr>
-          <w:rFonts w:ascii="Times New Roman" w:hAnsi="Times New Roman" w:cs="Times New Roman"/>
-        </w:rPr>
-        <w:t>}}.</w:t>
+        <w:t>Em atenção à solicitação remetida a esta Coordenadoria de Controle de Decisões, informamos que não há condenações envolvendo {{responsaveis}}.</w:t>
       </w:r>
     </w:p>
     <w:p>
@@ -231,21 +189,7 @@
         <w:rPr>
           <w:rFonts w:ascii="Times New Roman" w:hAnsi="Times New Roman" w:cs="Times New Roman"/>
         </w:rPr>
-        <w:t>{%</w:t>
-      </w:r>
-      <w:proofErr w:type="spellStart"/>
-      <w:r>
-        <w:rPr>
-          <w:rFonts w:ascii="Times New Roman" w:hAnsi="Times New Roman" w:cs="Times New Roman"/>
-        </w:rPr>
-        <w:t>else</w:t>
-      </w:r>
-      <w:proofErr w:type="spellEnd"/>
-      <w:r>
-        <w:rPr>
-          <w:rFonts w:ascii="Times New Roman" w:hAnsi="Times New Roman" w:cs="Times New Roman"/>
-        </w:rPr>
-        <w:t>%}</w:t>
+        <w:t>{%else%}</w:t>
       </w:r>
     </w:p>
     <w:p>
@@ -259,37 +203,23 @@
         <w:rPr>
           <w:rFonts w:ascii="Times New Roman" w:hAnsi="Times New Roman" w:cs="Times New Roman"/>
         </w:rPr>
-        <w:t>Em atenção à solicitação remetida a esta Coordenadoria de Controle de Decisões, segue abaixo o rol de condenações, débitos e respectivos trânsitos em julgado envolvendo {{</w:t>
-      </w:r>
-      <w:proofErr w:type="spellStart"/>
-      <w:r>
-        <w:rPr>
-          <w:rFonts w:ascii="Times New Roman" w:hAnsi="Times New Roman" w:cs="Times New Roman"/>
-        </w:rPr>
-        <w:t>responsaveis</w:t>
-      </w:r>
-      <w:proofErr w:type="spellEnd"/>
-      <w:r>
-        <w:rPr>
-          <w:rFonts w:ascii="Times New Roman" w:hAnsi="Times New Roman" w:cs="Times New Roman"/>
-        </w:rPr>
-        <w:t>}}.</w:t>
+        <w:t>Em atenção à solicitação remetida a esta Coordenadoria de Controle de Decisões, segue abaixo o rol de condenações, débitos e respectivos trânsitos em julgado envolvendo {{responsaveis}}.</w:t>
       </w:r>
     </w:p>
     <w:tbl>
       <w:tblPr>
         <w:tblW w:w="10632" w:type="dxa"/>
         <w:tblInd w:w="-459" w:type="dxa"/>
+        <w:tblBorders>
+          <w:top w:val="single" w:sz="4" w:space="0" w:color="2E5B3C"/>
+          <w:left w:val="single" w:sz="4" w:space="0" w:color="2E5B3C"/>
+          <w:bottom w:val="single" w:sz="4" w:space="0" w:color="2E5B3C"/>
+          <w:right w:val="single" w:sz="4" w:space="0" w:color="2E5B3C"/>
+          <w:insideH w:val="single" w:sz="4" w:space="0" w:color="CCCCCC"/>
+          <w:insideV w:val="single" w:sz="4" w:space="0" w:color="CCCCCC"/>
+        </w:tblBorders>
         <w:tblLayout w:type="fixed"/>
-        <w:tblLook w:val="0000"/>
-        <w:tblBorders>
-          <w:top w:val="single" w:sz="4" w:color="2E5B3C"/>
-          <w:bottom w:val="single" w:sz="4" w:color="2E5B3C"/>
-          <w:left w:val="single" w:sz="4" w:color="2E5B3C"/>
-          <w:right w:val="single" w:sz="4" w:color="2E5B3C"/>
-          <w:insideH w:val="single" w:sz="4" w:color="CCCCCC"/>
-          <w:insideV w:val="single" w:sz="4" w:color="CCCCCC"/>
-        </w:tblBorders>
+        <w:tblLook w:val="0000" w:firstRow="0" w:lastRow="0" w:firstColumn="0" w:lastColumn="0" w:noHBand="0" w:noVBand="0"/>
       </w:tblPr>
       <w:tblGrid>
         <w:gridCol w:w="1560"/>
@@ -306,10 +236,10 @@
             <w:tcW w:w="10632" w:type="dxa"/>
             <w:gridSpan w:val="7"/>
             <w:tcBorders>
-              <w:top w:val="single" w:sz="4" w:space="0" w:color="000000"/>
-              <w:left w:val="single" w:sz="4" w:space="0" w:color="000000"/>
-              <w:bottom w:val="single" w:sz="4" w:space="0" w:color="000000"/>
-              <w:right w:val="single" w:sz="4" w:space="0" w:color="000000"/>
+              <w:top w:val="nil"/>
+              <w:left w:val="nil"/>
+              <w:bottom w:val="single" w:sz="4" w:space="0" w:color="auto"/>
+              <w:right w:val="nil"/>
             </w:tcBorders>
           </w:tcPr>
           <w:p>
@@ -325,7 +255,7 @@
                 <w:bCs/>
                 <w:sz w:val="22"/>
               </w:rPr>
-              <w:t>{% for p in valores %}</w:t>
+              <w:t>{% for p in valores if p.transitos %}</w:t>
             </w:r>
           </w:p>
           <w:p>
@@ -348,163 +278,7 @@
                 <w:color w:val="2E5B3C"/>
                 <w:sz w:val="22"/>
               </w:rPr>
-              <w:t>Condenações de {{</w:t>
-            </w:r>
-            <w:proofErr w:type="spellStart"/>
-            <w:r>
-              <w:rPr>
-                <w:rFonts w:ascii="Times New Roman" w:hAnsi="Times New Roman" w:cs="Times New Roman"/>
-                <w:b/>
-                <w:bCs/>
-                <w:color w:val="2E5B3C"/>
-                <w:sz w:val="22"/>
-              </w:rPr>
-              <w:t>p.nome</w:t>
-            </w:r>
-            <w:proofErr w:type="spellEnd"/>
-            <w:r>
-              <w:rPr>
-                <w:rFonts w:ascii="Times New Roman" w:hAnsi="Times New Roman" w:cs="Times New Roman"/>
-                <w:b/>
-                <w:bCs/>
-                <w:color w:val="2E5B3C"/>
-                <w:sz w:val="22"/>
-              </w:rPr>
-              <w:t>}} {%</w:t>
-            </w:r>
-            <w:proofErr w:type="spellStart"/>
-            <w:proofErr w:type="gramStart"/>
-            <w:r>
-              <w:rPr>
-                <w:rFonts w:ascii="Times New Roman" w:hAnsi="Times New Roman" w:cs="Times New Roman"/>
-                <w:b/>
-                <w:bCs/>
-                <w:color w:val="2E5B3C"/>
-                <w:sz w:val="22"/>
-              </w:rPr>
-              <w:t>if</w:t>
-            </w:r>
-            <w:proofErr w:type="spellEnd"/>
-            <w:proofErr w:type="gramEnd"/>
-            <w:r>
-              <w:rPr>
-                <w:rFonts w:ascii="Times New Roman" w:hAnsi="Times New Roman" w:cs="Times New Roman"/>
-                <w:b/>
-                <w:bCs/>
-                <w:color w:val="2E5B3C"/>
-                <w:sz w:val="22"/>
-              </w:rPr>
-              <w:t xml:space="preserve"> </w:t>
-            </w:r>
-            <w:proofErr w:type="spellStart"/>
-            <w:r>
-              <w:rPr>
-                <w:rFonts w:ascii="Times New Roman" w:hAnsi="Times New Roman" w:cs="Times New Roman"/>
-                <w:b/>
-                <w:bCs/>
-                <w:color w:val="2E5B3C"/>
-                <w:sz w:val="22"/>
-              </w:rPr>
-              <w:t>p.cpf%</w:t>
-            </w:r>
-            <w:proofErr w:type="spellEnd"/>
-            <w:r>
-              <w:rPr>
-                <w:rFonts w:ascii="Times New Roman" w:hAnsi="Times New Roman" w:cs="Times New Roman"/>
-                <w:b/>
-                <w:bCs/>
-                <w:color w:val="2E5B3C"/>
-                <w:sz w:val="22"/>
-              </w:rPr>
-              <w:t>}(CPF: {{</w:t>
-            </w:r>
-            <w:proofErr w:type="spellStart"/>
-            <w:r>
-              <w:rPr>
-                <w:rFonts w:ascii="Times New Roman" w:hAnsi="Times New Roman" w:cs="Times New Roman"/>
-                <w:b/>
-                <w:bCs/>
-                <w:color w:val="2E5B3C"/>
-                <w:sz w:val="22"/>
-              </w:rPr>
-              <w:t>p.cpf</w:t>
-            </w:r>
-            <w:proofErr w:type="spellEnd"/>
-            <w:r>
-              <w:rPr>
-                <w:rFonts w:ascii="Times New Roman" w:hAnsi="Times New Roman" w:cs="Times New Roman"/>
-                <w:b/>
-                <w:bCs/>
-                <w:color w:val="2E5B3C"/>
-                <w:sz w:val="22"/>
-              </w:rPr>
-              <w:t>}}){%</w:t>
-            </w:r>
-            <w:proofErr w:type="spellStart"/>
-            <w:r>
-              <w:rPr>
-                <w:rFonts w:ascii="Times New Roman" w:hAnsi="Times New Roman" w:cs="Times New Roman"/>
-                <w:b/>
-                <w:bCs/>
-                <w:color w:val="2E5B3C"/>
-                <w:sz w:val="22"/>
-              </w:rPr>
-              <w:t>endif</w:t>
-            </w:r>
-            <w:proofErr w:type="spellEnd"/>
-            <w:r>
-              <w:rPr>
-                <w:rFonts w:ascii="Times New Roman" w:hAnsi="Times New Roman" w:cs="Times New Roman"/>
-                <w:b/>
-                <w:bCs/>
-                <w:color w:val="2E5B3C"/>
-                <w:sz w:val="22"/>
-              </w:rPr>
-              <w:t>%} {%</w:t>
-            </w:r>
-            <w:proofErr w:type="spellStart"/>
-            <w:r>
-              <w:rPr>
-                <w:rFonts w:ascii="Times New Roman" w:hAnsi="Times New Roman" w:cs="Times New Roman"/>
-                <w:b/>
-                <w:bCs/>
-                <w:color w:val="2E5B3C"/>
-                <w:sz w:val="22"/>
-              </w:rPr>
-              <w:t>if</w:t>
-            </w:r>
-            <w:proofErr w:type="spellEnd"/>
-            <w:r>
-              <w:rPr>
-                <w:rFonts w:ascii="Times New Roman" w:hAnsi="Times New Roman" w:cs="Times New Roman"/>
-                <w:b/>
-                <w:bCs/>
-                <w:color w:val="2E5B3C"/>
-                <w:sz w:val="22"/>
-              </w:rPr>
-              <w:t xml:space="preserve"> </w:t>
-            </w:r>
-            <w:proofErr w:type="spellStart"/>
-            <w:r>
-              <w:rPr>
-                <w:rFonts w:ascii="Times New Roman" w:hAnsi="Times New Roman" w:cs="Times New Roman"/>
-                <w:b/>
-                <w:bCs/>
-                <w:color w:val="2E5B3C"/>
-                <w:sz w:val="22"/>
-              </w:rPr>
-              <w:t>p.transitos|length</w:t>
-            </w:r>
-            <w:proofErr w:type="spellEnd"/>
-            <w:r>
-              <w:rPr>
-                <w:rFonts w:ascii="Times New Roman" w:hAnsi="Times New Roman" w:cs="Times New Roman"/>
-                <w:b/>
-                <w:bCs/>
-                <w:color w:val="2E5B3C"/>
-                <w:sz w:val="22"/>
-              </w:rPr>
-              <w:t xml:space="preserve"> &gt; 0%}</w:t>
+              <w:t>Condenações de {{p.nome}} {%if p.cpf%}(CPF: {{p.cpf}}){%endif%} {%if p.transitos|length &gt; 0%}</w:t>
             </w:r>
           </w:p>
         </w:tc>
@@ -514,10 +288,11 @@
           <w:tcPr>
             <w:tcW w:w="1560" w:type="dxa"/>
             <w:tcBorders>
+              <w:top w:val="single" w:sz="4" w:space="0" w:color="auto"/>
               <w:left w:val="single" w:sz="4" w:space="0" w:color="000000"/>
               <w:bottom w:val="single" w:sz="4" w:space="0" w:color="000000"/>
             </w:tcBorders>
-            <w:shd w:val="clear" w:fill="2E5B3C"/>
+            <w:shd w:val="clear" w:color="auto" w:fill="2E5B3C"/>
           </w:tcPr>
           <w:p>
             <w:pPr>
@@ -538,10 +313,11 @@
           <w:tcPr>
             <w:tcW w:w="1417" w:type="dxa"/>
             <w:tcBorders>
+              <w:top w:val="single" w:sz="4" w:space="0" w:color="auto"/>
               <w:left w:val="single" w:sz="4" w:space="0" w:color="000000"/>
               <w:bottom w:val="single" w:sz="4" w:space="0" w:color="000000"/>
             </w:tcBorders>
-            <w:shd w:val="clear" w:fill="2E5B3C"/>
+            <w:shd w:val="clear" w:color="auto" w:fill="2E5B3C"/>
           </w:tcPr>
           <w:p>
             <w:pPr>
@@ -562,10 +338,11 @@
           <w:tcPr>
             <w:tcW w:w="1559" w:type="dxa"/>
             <w:tcBorders>
+              <w:top w:val="single" w:sz="4" w:space="0" w:color="auto"/>
               <w:left w:val="single" w:sz="4" w:space="0" w:color="000000"/>
               <w:bottom w:val="single" w:sz="4" w:space="0" w:color="000000"/>
             </w:tcBorders>
-            <w:shd w:val="clear" w:fill="2E5B3C"/>
+            <w:shd w:val="clear" w:color="auto" w:fill="2E5B3C"/>
           </w:tcPr>
           <w:p>
             <w:pPr>
@@ -586,10 +363,11 @@
           <w:tcPr>
             <w:tcW w:w="1276" w:type="dxa"/>
             <w:tcBorders>
+              <w:top w:val="single" w:sz="4" w:space="0" w:color="auto"/>
               <w:left w:val="single" w:sz="4" w:space="0" w:color="000000"/>
               <w:bottom w:val="single" w:sz="4" w:space="0" w:color="000000"/>
             </w:tcBorders>
-            <w:shd w:val="clear" w:fill="2E5B3C"/>
+            <w:shd w:val="clear" w:color="auto" w:fill="2E5B3C"/>
           </w:tcPr>
           <w:p>
             <w:pPr>
@@ -610,10 +388,11 @@
           <w:tcPr>
             <w:tcW w:w="1418" w:type="dxa"/>
             <w:tcBorders>
+              <w:top w:val="single" w:sz="4" w:space="0" w:color="auto"/>
               <w:left w:val="single" w:sz="4" w:space="0" w:color="000000"/>
               <w:bottom w:val="single" w:sz="4" w:space="0" w:color="000000"/>
             </w:tcBorders>
-            <w:shd w:val="clear" w:fill="2E5B3C"/>
+            <w:shd w:val="clear" w:color="auto" w:fill="2E5B3C"/>
           </w:tcPr>
           <w:p>
             <w:pPr>
@@ -634,10 +413,11 @@
           <w:tcPr>
             <w:tcW w:w="1417" w:type="dxa"/>
             <w:tcBorders>
+              <w:top w:val="single" w:sz="4" w:space="0" w:color="auto"/>
               <w:left w:val="single" w:sz="4" w:space="0" w:color="000000"/>
               <w:bottom w:val="single" w:sz="4" w:space="0" w:color="000000"/>
             </w:tcBorders>
-            <w:shd w:val="clear" w:fill="2E5B3C"/>
+            <w:shd w:val="clear" w:color="auto" w:fill="2E5B3C"/>
           </w:tcPr>
           <w:p>
             <w:pPr>
@@ -658,11 +438,12 @@
           <w:tcPr>
             <w:tcW w:w="1985" w:type="dxa"/>
             <w:tcBorders>
+              <w:top w:val="single" w:sz="4" w:space="0" w:color="auto"/>
               <w:left w:val="single" w:sz="4" w:space="0" w:color="000000"/>
               <w:bottom w:val="single" w:sz="4" w:space="0" w:color="000000"/>
               <w:right w:val="single" w:sz="4" w:space="0" w:color="000000"/>
             </w:tcBorders>
-            <w:shd w:val="clear" w:fill="2E5B3C"/>
+            <w:shd w:val="clear" w:color="auto" w:fill="2E5B3C"/>
           </w:tcPr>
           <w:p>
             <w:pPr>
@@ -697,32 +478,18 @@
               <w:pStyle w:val="Default"/>
               <w:spacing w:line="360" w:lineRule="auto"/>
               <w:jc w:val="center"/>
+              <w:rPr>
+                <w:lang w:val="en-US"/>
+              </w:rPr>
             </w:pPr>
             <w:r>
               <w:rPr>
                 <w:rFonts w:ascii="Times New Roman" w:hAnsi="Times New Roman" w:cs="Times New Roman"/>
                 <w:b/>
                 <w:sz w:val="22"/>
-              </w:rPr>
-              <w:t xml:space="preserve">{%- for v in </w:t>
-            </w:r>
-            <w:proofErr w:type="spellStart"/>
-            <w:r>
-              <w:rPr>
-                <w:rFonts w:ascii="Times New Roman" w:hAnsi="Times New Roman" w:cs="Times New Roman"/>
-                <w:b/>
-                <w:sz w:val="22"/>
-              </w:rPr>
-              <w:t>p.transitos</w:t>
-            </w:r>
-            <w:proofErr w:type="spellEnd"/>
-            <w:r>
-              <w:rPr>
-                <w:rFonts w:ascii="Times New Roman" w:hAnsi="Times New Roman" w:cs="Times New Roman"/>
-                <w:b/>
-                <w:sz w:val="22"/>
-              </w:rPr>
-              <w:t xml:space="preserve"> %}</w:t>
+                <w:lang w:val="en-US"/>
+              </w:rPr>
+              <w:t>{%- for v in p.transitos %}</w:t>
             </w:r>
           </w:p>
         </w:tc>
@@ -749,25 +516,7 @@
                 <w:color w:val="333333"/>
                 <w:sz w:val="22"/>
               </w:rPr>
-              <w:t>{{</w:t>
-            </w:r>
-            <w:proofErr w:type="spellStart"/>
-            <w:r>
-              <w:rPr>
-                <w:rFonts w:ascii="Times New Roman" w:hAnsi="Times New Roman" w:cs="Times New Roman"/>
-                <w:color w:val="333333"/>
-                <w:sz w:val="22"/>
-              </w:rPr>
-              <w:t>v.processo_origem</w:t>
-            </w:r>
-            <w:proofErr w:type="spellEnd"/>
-            <w:r>
-              <w:rPr>
-                <w:rFonts w:ascii="Times New Roman" w:hAnsi="Times New Roman" w:cs="Times New Roman"/>
-                <w:color w:val="333333"/>
-                <w:sz w:val="22"/>
-              </w:rPr>
-              <w:t>}}</w:t>
+              <w:t>{{v.processo_origem}}</w:t>
             </w:r>
           </w:p>
         </w:tc>
@@ -792,25 +541,7 @@
                 <w:color w:val="333333"/>
                 <w:sz w:val="22"/>
               </w:rPr>
-              <w:t>{{</w:t>
-            </w:r>
-            <w:proofErr w:type="spellStart"/>
-            <w:r>
-              <w:rPr>
-                <w:rFonts w:ascii="Times New Roman" w:hAnsi="Times New Roman" w:cs="Times New Roman"/>
-                <w:color w:val="333333"/>
-                <w:sz w:val="22"/>
-              </w:rPr>
-              <w:t>v.processo_execucao</w:t>
-            </w:r>
-            <w:proofErr w:type="spellEnd"/>
-            <w:r>
-              <w:rPr>
-                <w:rFonts w:ascii="Times New Roman" w:hAnsi="Times New Roman" w:cs="Times New Roman"/>
-                <w:color w:val="333333"/>
-                <w:sz w:val="22"/>
-              </w:rPr>
-              <w:t>}}</w:t>
+              <w:t>{{v.processo_execucao}}</w:t>
             </w:r>
           </w:p>
         </w:tc>
@@ -835,25 +566,7 @@
                 <w:color w:val="333333"/>
                 <w:sz w:val="22"/>
               </w:rPr>
-              <w:t>{{</w:t>
-            </w:r>
-            <w:proofErr w:type="spellStart"/>
-            <w:r>
-              <w:rPr>
-                <w:rFonts w:ascii="Times New Roman" w:hAnsi="Times New Roman" w:cs="Times New Roman"/>
-                <w:color w:val="333333"/>
-                <w:sz w:val="22"/>
-              </w:rPr>
-              <w:t>v.tipo_debito</w:t>
-            </w:r>
-            <w:proofErr w:type="spellEnd"/>
-            <w:r>
-              <w:rPr>
-                <w:rFonts w:ascii="Times New Roman" w:hAnsi="Times New Roman" w:cs="Times New Roman"/>
-                <w:color w:val="333333"/>
-                <w:sz w:val="22"/>
-              </w:rPr>
-              <w:t>}}</w:t>
+              <w:t>{{v.tipo_debito}}</w:t>
             </w:r>
           </w:p>
         </w:tc>
@@ -878,25 +591,7 @@
                 <w:color w:val="333333"/>
                 <w:sz w:val="22"/>
               </w:rPr>
-              <w:t>{{</w:t>
-            </w:r>
-            <w:proofErr w:type="spellStart"/>
-            <w:r>
-              <w:rPr>
-                <w:rFonts w:ascii="Times New Roman" w:hAnsi="Times New Roman" w:cs="Times New Roman"/>
-                <w:color w:val="333333"/>
-                <w:sz w:val="22"/>
-              </w:rPr>
-              <w:t>v.valor_original</w:t>
-            </w:r>
-            <w:proofErr w:type="spellEnd"/>
-            <w:r>
-              <w:rPr>
-                <w:rFonts w:ascii="Times New Roman" w:hAnsi="Times New Roman" w:cs="Times New Roman"/>
-                <w:color w:val="333333"/>
-                <w:sz w:val="22"/>
-              </w:rPr>
-              <w:t>}}</w:t>
+              <w:t>{{v.valor_original}}</w:t>
             </w:r>
           </w:p>
         </w:tc>
@@ -921,25 +616,7 @@
                 <w:color w:val="333333"/>
                 <w:sz w:val="22"/>
               </w:rPr>
-              <w:t>{{</w:t>
-            </w:r>
-            <w:proofErr w:type="spellStart"/>
-            <w:r>
-              <w:rPr>
-                <w:rFonts w:ascii="Times New Roman" w:hAnsi="Times New Roman" w:cs="Times New Roman"/>
-                <w:color w:val="333333"/>
-                <w:sz w:val="22"/>
-              </w:rPr>
-              <w:t>v.valor_atualizado</w:t>
-            </w:r>
-            <w:proofErr w:type="spellEnd"/>
-            <w:r>
-              <w:rPr>
-                <w:rFonts w:ascii="Times New Roman" w:hAnsi="Times New Roman" w:cs="Times New Roman"/>
-                <w:color w:val="333333"/>
-                <w:sz w:val="22"/>
-              </w:rPr>
-              <w:t>}}</w:t>
+              <w:t>{{v.valor_atualizado}}</w:t>
             </w:r>
           </w:p>
         </w:tc>
@@ -964,25 +641,7 @@
                 <w:color w:val="333333"/>
                 <w:sz w:val="22"/>
               </w:rPr>
-              <w:t>{{</w:t>
-            </w:r>
-            <w:proofErr w:type="spellStart"/>
-            <w:r>
-              <w:rPr>
-                <w:rFonts w:ascii="Times New Roman" w:hAnsi="Times New Roman" w:cs="Times New Roman"/>
-                <w:color w:val="333333"/>
-                <w:sz w:val="22"/>
-              </w:rPr>
-              <w:t>v.transito_julgado</w:t>
-            </w:r>
-            <w:proofErr w:type="spellEnd"/>
-            <w:r>
-              <w:rPr>
-                <w:rFonts w:ascii="Times New Roman" w:hAnsi="Times New Roman" w:cs="Times New Roman"/>
-                <w:color w:val="333333"/>
-                <w:sz w:val="22"/>
-              </w:rPr>
-              <w:t>}}</w:t>
+              <w:t>{{v.transito_julgado}}</w:t>
             </w:r>
           </w:p>
         </w:tc>
@@ -1008,25 +667,37 @@
                 <w:color w:val="333333"/>
                 <w:sz w:val="22"/>
               </w:rPr>
-              <w:t>{{</w:t>
-            </w:r>
-            <w:proofErr w:type="spellStart"/>
+              <w:t>{{v.situacao_divida}}</w:t>
+            </w:r>
+          </w:p>
+          <w:p>
+            <w:pPr>
+              <w:pStyle w:val="Default"/>
+              <w:spacing w:line="360" w:lineRule="auto"/>
+              <w:jc w:val="center"/>
+            </w:pPr>
             <w:r>
               <w:rPr>
                 <w:rFonts w:ascii="Times New Roman" w:hAnsi="Times New Roman" w:cs="Times New Roman"/>
                 <w:color w:val="333333"/>
                 <w:sz w:val="22"/>
               </w:rPr>
-              <w:t>v.situacao_divida</w:t>
-            </w:r>
-            <w:proofErr w:type="spellEnd"/>
+              <w:t>{% if v.status_protesto %}</w:t>
+            </w:r>
+          </w:p>
+          <w:p>
+            <w:pPr>
+              <w:pStyle w:val="Default"/>
+              <w:spacing w:line="360" w:lineRule="auto"/>
+              <w:jc w:val="center"/>
+            </w:pPr>
             <w:r>
               <w:rPr>
                 <w:rFonts w:ascii="Times New Roman" w:hAnsi="Times New Roman" w:cs="Times New Roman"/>
                 <w:color w:val="333333"/>
                 <w:sz w:val="22"/>
               </w:rPr>
-              <w:t>}}</w:t>
+              <w:t>- Situação Protesto:</w:t>
             </w:r>
           </w:p>
           <w:p>
@@ -1041,248 +712,61 @@
                 <w:color w:val="333333"/>
                 <w:sz w:val="22"/>
               </w:rPr>
-              <w:t xml:space="preserve">{% </w:t>
-            </w:r>
-            <w:proofErr w:type="spellStart"/>
-            <w:proofErr w:type="gramStart"/>
+              <w:t>{% endif %} {{v.status_protesto}}</w:t>
+            </w:r>
+          </w:p>
+          <w:p>
+            <w:pPr>
+              <w:pStyle w:val="Default"/>
+              <w:spacing w:line="360" w:lineRule="auto"/>
+              <w:jc w:val="center"/>
+            </w:pPr>
             <w:r>
               <w:rPr>
                 <w:rFonts w:ascii="Times New Roman" w:hAnsi="Times New Roman" w:cs="Times New Roman"/>
                 <w:color w:val="333333"/>
                 <w:sz w:val="22"/>
               </w:rPr>
-              <w:t>if</w:t>
-            </w:r>
-            <w:proofErr w:type="spellEnd"/>
-            <w:proofErr w:type="gramEnd"/>
+              <w:t>{% if v.status_pge %}</w:t>
+            </w:r>
+          </w:p>
+          <w:p>
+            <w:pPr>
+              <w:pStyle w:val="Default"/>
+              <w:spacing w:line="360" w:lineRule="auto"/>
+              <w:jc w:val="center"/>
+            </w:pPr>
             <w:r>
               <w:rPr>
                 <w:rFonts w:ascii="Times New Roman" w:hAnsi="Times New Roman" w:cs="Times New Roman"/>
                 <w:color w:val="333333"/>
                 <w:sz w:val="22"/>
               </w:rPr>
-              <w:t xml:space="preserve"> </w:t>
-            </w:r>
-            <w:proofErr w:type="spellStart"/>
+              <w:t>- Situação PGE:</w:t>
+            </w:r>
+          </w:p>
+          <w:p>
+            <w:pPr>
+              <w:pStyle w:val="Default"/>
+              <w:spacing w:line="360" w:lineRule="auto"/>
+              <w:jc w:val="center"/>
+            </w:pPr>
             <w:r>
               <w:rPr>
                 <w:rFonts w:ascii="Times New Roman" w:hAnsi="Times New Roman" w:cs="Times New Roman"/>
                 <w:color w:val="333333"/>
                 <w:sz w:val="22"/>
               </w:rPr>
-              <w:t>v.status_protesto</w:t>
-            </w:r>
-            <w:proofErr w:type="spellEnd"/>
+              <w:t>{% endif %}{{v.status_pge}</w:t>
+            </w:r>
             <w:r>
               <w:rPr>
                 <w:rFonts w:ascii="Times New Roman" w:hAnsi="Times New Roman" w:cs="Times New Roman"/>
                 <w:color w:val="333333"/>
                 <w:sz w:val="22"/>
               </w:rPr>
-              <w:t xml:space="preserve"> %}</w:t>
-            </w:r>
-          </w:p>
-          <w:p>
-            <w:pPr>
-              <w:pStyle w:val="Default"/>
-              <w:spacing w:line="360" w:lineRule="auto"/>
-              <w:jc w:val="center"/>
-            </w:pPr>
-            <w:r>
-              <w:rPr>
-                <w:rFonts w:ascii="Times New Roman" w:hAnsi="Times New Roman" w:cs="Times New Roman"/>
-                <w:color w:val="333333"/>
-                <w:sz w:val="22"/>
-              </w:rPr>
-              <w:t>- Situação Protesto:</w:t>
-            </w:r>
-          </w:p>
-          <w:p>
-            <w:pPr>
-              <w:pStyle w:val="Default"/>
-              <w:spacing w:line="360" w:lineRule="auto"/>
-              <w:jc w:val="center"/>
-            </w:pPr>
-            <w:r>
-              <w:rPr>
-                <w:rFonts w:ascii="Times New Roman" w:hAnsi="Times New Roman" w:cs="Times New Roman"/>
-                <w:color w:val="333333"/>
-                <w:sz w:val="22"/>
-              </w:rPr>
-              <w:t xml:space="preserve">{% </w:t>
-            </w:r>
-            <w:proofErr w:type="spellStart"/>
-            <w:r>
-              <w:rPr>
-                <w:rFonts w:ascii="Times New Roman" w:hAnsi="Times New Roman" w:cs="Times New Roman"/>
-                <w:color w:val="333333"/>
-                <w:sz w:val="22"/>
-              </w:rPr>
-              <w:t>endif</w:t>
-            </w:r>
-            <w:proofErr w:type="spellEnd"/>
-            <w:r>
-              <w:rPr>
-                <w:rFonts w:ascii="Times New Roman" w:hAnsi="Times New Roman" w:cs="Times New Roman"/>
-                <w:color w:val="333333"/>
-                <w:sz w:val="22"/>
-              </w:rPr>
-              <w:t xml:space="preserve"> %} {{</w:t>
-            </w:r>
-            <w:proofErr w:type="spellStart"/>
-            <w:r>
-              <w:rPr>
-                <w:rFonts w:ascii="Times New Roman" w:hAnsi="Times New Roman" w:cs="Times New Roman"/>
-                <w:color w:val="333333"/>
-                <w:sz w:val="22"/>
-              </w:rPr>
-              <w:t>v.status_protesto</w:t>
-            </w:r>
-            <w:proofErr w:type="spellEnd"/>
-            <w:r>
-              <w:rPr>
-                <w:rFonts w:ascii="Times New Roman" w:hAnsi="Times New Roman" w:cs="Times New Roman"/>
-                <w:color w:val="333333"/>
-                <w:sz w:val="22"/>
-              </w:rPr>
-              <w:t>}}</w:t>
-            </w:r>
-          </w:p>
-          <w:p>
-            <w:pPr>
-              <w:pStyle w:val="Default"/>
-              <w:spacing w:line="360" w:lineRule="auto"/>
-              <w:jc w:val="center"/>
-            </w:pPr>
-            <w:r>
-              <w:rPr>
-                <w:rFonts w:ascii="Times New Roman" w:hAnsi="Times New Roman" w:cs="Times New Roman"/>
-                <w:color w:val="333333"/>
-                <w:sz w:val="22"/>
-              </w:rPr>
-              <w:t xml:space="preserve">{% </w:t>
-            </w:r>
-            <w:proofErr w:type="spellStart"/>
-            <w:proofErr w:type="gramStart"/>
-            <w:r>
-              <w:rPr>
-                <w:rFonts w:ascii="Times New Roman" w:hAnsi="Times New Roman" w:cs="Times New Roman"/>
-                <w:color w:val="333333"/>
-                <w:sz w:val="22"/>
-              </w:rPr>
-              <w:t>if</w:t>
-            </w:r>
-            <w:proofErr w:type="spellEnd"/>
-            <w:proofErr w:type="gramEnd"/>
-            <w:r>
-              <w:rPr>
-                <w:rFonts w:ascii="Times New Roman" w:hAnsi="Times New Roman" w:cs="Times New Roman"/>
-                <w:color w:val="333333"/>
-                <w:sz w:val="22"/>
-              </w:rPr>
-              <w:t xml:space="preserve"> </w:t>
-            </w:r>
-            <w:proofErr w:type="spellStart"/>
-            <w:r>
-              <w:rPr>
-                <w:rFonts w:ascii="Times New Roman" w:hAnsi="Times New Roman" w:cs="Times New Roman"/>
-                <w:color w:val="333333"/>
-                <w:sz w:val="22"/>
-              </w:rPr>
-              <w:t>v.status_pge</w:t>
-            </w:r>
-            <w:proofErr w:type="spellEnd"/>
-            <w:r>
-              <w:rPr>
-                <w:rFonts w:ascii="Times New Roman" w:hAnsi="Times New Roman" w:cs="Times New Roman"/>
-                <w:color w:val="333333"/>
-                <w:sz w:val="22"/>
-              </w:rPr>
-              <w:t xml:space="preserve"> %}</w:t>
-            </w:r>
-          </w:p>
-          <w:p>
-            <w:pPr>
-              <w:pStyle w:val="Default"/>
-              <w:spacing w:line="360" w:lineRule="auto"/>
-              <w:jc w:val="center"/>
-            </w:pPr>
-            <w:r>
-              <w:rPr>
-                <w:rFonts w:ascii="Times New Roman" w:hAnsi="Times New Roman" w:cs="Times New Roman"/>
-                <w:color w:val="333333"/>
-                <w:sz w:val="22"/>
-              </w:rPr>
-              <w:t>- Situação PGE:</w:t>
-            </w:r>
-          </w:p>
-          <w:p>
-            <w:pPr>
-              <w:pStyle w:val="Default"/>
-              <w:spacing w:line="360" w:lineRule="auto"/>
-              <w:jc w:val="center"/>
-            </w:pPr>
-            <w:r>
-              <w:rPr>
-                <w:rFonts w:ascii="Times New Roman" w:hAnsi="Times New Roman" w:cs="Times New Roman"/>
-                <w:color w:val="333333"/>
-                <w:sz w:val="22"/>
-              </w:rPr>
-              <w:t xml:space="preserve">{% </w:t>
-            </w:r>
-            <w:proofErr w:type="spellStart"/>
-            <w:r>
-              <w:rPr>
-                <w:rFonts w:ascii="Times New Roman" w:hAnsi="Times New Roman" w:cs="Times New Roman"/>
-                <w:color w:val="333333"/>
-                <w:sz w:val="22"/>
-              </w:rPr>
-              <w:t>endif</w:t>
-            </w:r>
-            <w:proofErr w:type="spellEnd"/>
-            <w:r>
-              <w:rPr>
-                <w:rFonts w:ascii="Times New Roman" w:hAnsi="Times New Roman" w:cs="Times New Roman"/>
-                <w:color w:val="333333"/>
-                <w:sz w:val="22"/>
-              </w:rPr>
-              <w:t xml:space="preserve"> %</w:t>
-            </w:r>
-            <w:proofErr w:type="gramStart"/>
-            <w:r>
-              <w:rPr>
-                <w:rFonts w:ascii="Times New Roman" w:hAnsi="Times New Roman" w:cs="Times New Roman"/>
-                <w:color w:val="333333"/>
-                <w:sz w:val="22"/>
-              </w:rPr>
-              <w:t>}{</w:t>
-            </w:r>
-            <w:proofErr w:type="gramEnd"/>
-            <w:r>
-              <w:rPr>
-                <w:rFonts w:ascii="Times New Roman" w:hAnsi="Times New Roman" w:cs="Times New Roman"/>
-                <w:color w:val="333333"/>
-                <w:sz w:val="22"/>
-              </w:rPr>
-              <w:t>{</w:t>
-            </w:r>
-            <w:proofErr w:type="spellStart"/>
-            <w:r>
-              <w:rPr>
-                <w:rFonts w:ascii="Times New Roman" w:hAnsi="Times New Roman" w:cs="Times New Roman"/>
-                <w:color w:val="333333"/>
-                <w:sz w:val="22"/>
-              </w:rPr>
-              <w:t>v.status_pge</w:t>
-            </w:r>
-            <w:proofErr w:type="spellEnd"/>
-            <w:r>
-              <w:rPr>
-                <w:rFonts w:ascii="Times New Roman" w:hAnsi="Times New Roman" w:cs="Times New Roman"/>
-                <w:color w:val="333333"/>
-                <w:sz w:val="22"/>
-              </w:rPr>
-              <w:t>}}</w:t>
+              <w:lastRenderedPageBreak/>
+              <w:t>}</w:t>
             </w:r>
           </w:p>
         </w:tc>
@@ -1314,39 +798,7 @@
                 <w:sz w:val="22"/>
               </w:rPr>
               <w:lastRenderedPageBreak/>
-              <w:t xml:space="preserve">{%- </w:t>
-            </w:r>
-            <w:proofErr w:type="spellStart"/>
-            <w:r>
-              <w:rPr>
-                <w:rFonts w:ascii="Times New Roman" w:hAnsi="Times New Roman" w:cs="Times New Roman"/>
-                <w:sz w:val="22"/>
-              </w:rPr>
-              <w:t>endfor</w:t>
-            </w:r>
-            <w:proofErr w:type="spellEnd"/>
-            <w:r>
-              <w:rPr>
-                <w:rFonts w:ascii="Times New Roman" w:hAnsi="Times New Roman" w:cs="Times New Roman"/>
-                <w:sz w:val="22"/>
-              </w:rPr>
-              <w:t xml:space="preserve"> %} {%</w:t>
-            </w:r>
-            <w:proofErr w:type="spellStart"/>
-            <w:r>
-              <w:rPr>
-                <w:rFonts w:ascii="Times New Roman" w:hAnsi="Times New Roman" w:cs="Times New Roman"/>
-                <w:sz w:val="22"/>
-              </w:rPr>
-              <w:t>else</w:t>
-            </w:r>
-            <w:proofErr w:type="spellEnd"/>
-            <w:r>
-              <w:rPr>
-                <w:rFonts w:ascii="Times New Roman" w:hAnsi="Times New Roman" w:cs="Times New Roman"/>
-                <w:sz w:val="22"/>
-              </w:rPr>
-              <w:t>%}</w:t>
+              <w:t>{%- endfor %} {%else%}</w:t>
             </w:r>
           </w:p>
         </w:tc>
@@ -1394,47 +846,7 @@
                 <w:color w:val="2E5B3C"/>
                 <w:sz w:val="22"/>
               </w:rPr>
-              <w:t>Não há condenações para {{</w:t>
-            </w:r>
-            <w:proofErr w:type="spellStart"/>
-            <w:r>
-              <w:rPr>
-                <w:rFonts w:ascii="Times New Roman" w:hAnsi="Times New Roman" w:cs="Times New Roman"/>
-                <w:b/>
-                <w:color w:val="2E5B3C"/>
-                <w:sz w:val="22"/>
-              </w:rPr>
-              <w:t>p.nome</w:t>
-            </w:r>
-            <w:proofErr w:type="spellEnd"/>
-            <w:r>
-              <w:rPr>
-                <w:rFonts w:ascii="Times New Roman" w:hAnsi="Times New Roman" w:cs="Times New Roman"/>
-                <w:b/>
-                <w:color w:val="2E5B3C"/>
-                <w:sz w:val="22"/>
-              </w:rPr>
-              <w:t xml:space="preserve">}} {% </w:t>
-            </w:r>
-            <w:proofErr w:type="spellStart"/>
-            <w:r>
-              <w:rPr>
-                <w:rFonts w:ascii="Times New Roman" w:hAnsi="Times New Roman" w:cs="Times New Roman"/>
-                <w:b/>
-                <w:color w:val="2E5B3C"/>
-                <w:sz w:val="22"/>
-              </w:rPr>
-              <w:t>endif</w:t>
-            </w:r>
-            <w:proofErr w:type="spellEnd"/>
-            <w:r>
-              <w:rPr>
-                <w:rFonts w:ascii="Times New Roman" w:hAnsi="Times New Roman" w:cs="Times New Roman"/>
-                <w:b/>
-                <w:color w:val="2E5B3C"/>
-                <w:sz w:val="22"/>
-              </w:rPr>
-              <w:t xml:space="preserve"> %}</w:t>
+              <w:t>Não há condenações para {{p.nome}} {% endif %}</w:t>
             </w:r>
           </w:p>
         </w:tc>
@@ -1462,23 +874,7 @@
                 <w:rFonts w:ascii="Times New Roman" w:hAnsi="Times New Roman" w:cs="Times New Roman"/>
                 <w:sz w:val="22"/>
               </w:rPr>
-              <w:t>{%</w:t>
-            </w:r>
-            <w:proofErr w:type="spellStart"/>
-            <w:r>
-              <w:rPr>
-                <w:rFonts w:ascii="Times New Roman" w:hAnsi="Times New Roman" w:cs="Times New Roman"/>
-                <w:sz w:val="22"/>
-              </w:rPr>
-              <w:t>endfor</w:t>
-            </w:r>
-            <w:proofErr w:type="spellEnd"/>
-            <w:r>
-              <w:rPr>
-                <w:rFonts w:ascii="Times New Roman" w:hAnsi="Times New Roman" w:cs="Times New Roman"/>
-                <w:sz w:val="22"/>
-              </w:rPr>
-              <w:t xml:space="preserve"> %}</w:t>
+              <w:t>{%endfor %}</w:t>
             </w:r>
           </w:p>
         </w:tc>
@@ -1506,21 +902,7 @@
         <w:rPr>
           <w:rFonts w:ascii="Times New Roman" w:hAnsi="Times New Roman" w:cs="Times New Roman"/>
         </w:rPr>
-        <w:t>{%</w:t>
-      </w:r>
-      <w:proofErr w:type="spellStart"/>
-      <w:r>
-        <w:rPr>
-          <w:rFonts w:ascii="Times New Roman" w:hAnsi="Times New Roman" w:cs="Times New Roman"/>
-        </w:rPr>
-        <w:t>endif</w:t>
-      </w:r>
-      <w:proofErr w:type="spellEnd"/>
-      <w:r>
-        <w:rPr>
-          <w:rFonts w:ascii="Times New Roman" w:hAnsi="Times New Roman" w:cs="Times New Roman"/>
-        </w:rPr>
-        <w:t>%}</w:t>
+        <w:t>{%p if sem_condenacoes %}</w:t>
       </w:r>
     </w:p>
     <w:p>
@@ -1534,7 +916,7 @@
         <w:rPr>
           <w:rFonts w:ascii="Times New Roman" w:hAnsi="Times New Roman" w:cs="Times New Roman"/>
         </w:rPr>
-        <w:t xml:space="preserve">Pelo exposto, encaminhe-se ao gabinete requerente da informação apresentada, para análise e prosseguimento do feito. </w:t>
+        <w:t>Não há condenações para {{sem_condenacoes}}.</w:t>
       </w:r>
     </w:p>
     <w:p>
@@ -1543,21 +925,78 @@
         <w:spacing w:line="360" w:lineRule="auto"/>
         <w:ind w:firstLine="1418"/>
         <w:jc w:val="both"/>
+      </w:pPr>
+      <w:r>
         <w:rPr>
           <w:rFonts w:ascii="Times New Roman" w:hAnsi="Times New Roman" w:cs="Times New Roman"/>
         </w:rPr>
-      </w:pPr>
+        <w:t>{%p endif %}</w:t>
+      </w:r>
     </w:p>
     <w:p>
       <w:pPr>
         <w:pStyle w:val="Default"/>
+        <w:spacing w:line="360" w:lineRule="auto"/>
+        <w:ind w:firstLine="1418"/>
+        <w:jc w:val="both"/>
+      </w:pPr>
+      <w:r>
+        <w:rPr>
+          <w:rFonts w:ascii="Times New Roman" w:hAnsi="Times New Roman" w:cs="Times New Roman"/>
+        </w:rPr>
+        <w:t>{%endif%}</w:t>
+      </w:r>
+    </w:p>
+    <w:p>
+      <w:pPr>
+        <w:pStyle w:val="Default"/>
+        <w:spacing w:line="360" w:lineRule="auto"/>
+        <w:ind w:firstLine="1418"/>
+        <w:jc w:val="both"/>
+      </w:pPr>
+      <w:r>
+        <w:rPr>
+          <w:rFonts w:ascii="Times New Roman" w:hAnsi="Times New Roman" w:cs="Times New Roman"/>
+        </w:rPr>
+        <w:t xml:space="preserve">Ante o exposto, encaminhe-se ao gabinete requerente da informação apresentada, para análise e prosseguimento do feito. </w:t>
+      </w:r>
+    </w:p>
+    <w:p>
+      <w:pPr>
+        <w:pStyle w:val="Default"/>
+        <w:spacing w:line="360" w:lineRule="auto"/>
+        <w:ind w:firstLine="1418"/>
+        <w:jc w:val="both"/>
+        <w:rPr>
+          <w:rFonts w:ascii="Times New Roman" w:hAnsi="Times New Roman" w:cs="Times New Roman"/>
+        </w:rPr>
+      </w:pPr>
+    </w:p>
+    <w:p>
+      <w:pPr>
+        <w:pStyle w:val="Default"/>
+        <w:spacing w:line="360" w:lineRule="auto"/>
+        <w:ind w:firstLine="1418"/>
+        <w:jc w:val="both"/>
+        <w:rPr>
+          <w:rFonts w:ascii="Times New Roman" w:hAnsi="Times New Roman" w:cs="Times New Roman"/>
+        </w:rPr>
+      </w:pPr>
+    </w:p>
+    <w:p>
+      <w:pPr>
         <w:jc w:val="center"/>
-      </w:pPr>
-      <w:r>
-        <w:rPr>
-          <w:rFonts w:ascii="Times New Roman" w:hAnsi="Times New Roman" w:cs="Times New Roman"/>
-        </w:rPr>
-        <w:t>Natal/RN, {{data}}.</w:t>
+        <w:rPr>
+          <w:i/>
+          <w:iCs/>
+        </w:rPr>
+      </w:pPr>
+      <w:r>
+        <w:rPr>
+          <w:i/>
+          <w:iCs/>
+        </w:rPr>
+        <w:t>[assinado digitalmente]</w:t>
       </w:r>
     </w:p>
     <w:p>
@@ -1592,26 +1031,23 @@
       <w:pPr>
         <w:jc w:val="center"/>
       </w:pPr>
-      <w:proofErr w:type="spellStart"/>
-      <w:proofErr w:type="spellEnd"/>
+      <w:r>
+        <w:rPr>
+          <w:bCs/>
+        </w:rPr>
+        <w:t>Eduardo Pereira Lima</w:t>
+      </w:r>
       <w:r>
         <w:rPr>
           <w:b/>
         </w:rPr>
-        <w:t>Eduardo Pereira Lima</w:t>
         <w:br/>
       </w:r>
       <w:r>
-        <w:rPr>
-          <w:b w:val="0"/>
-        </w:rPr>
         <w:t>Auditor de Controle Externo</w:t>
+      </w:r>
+      <w:r>
         <w:br/>
-      </w:r>
-      <w:r>
-        <w:rPr>
-          <w:b w:val="0"/>
-        </w:rPr>
         <w:t>Coordenador de Controle de Decisões</w:t>
       </w:r>
     </w:p>
@@ -1640,7 +1076,7 @@
 </file>
 
 <file path=word/endnotes.xml><?xml version="1.0" encoding="utf-8"?>
-<w:endnotes xmlns:ve="http://schemas.openxmlformats.org/markup-compatibility/2006" xmlns:o="urn:schemas-microsoft-com:office:office" xmlns:r="http://schemas.openxmlformats.org/officeDocument/2006/relationships" xmlns:m="http://schemas.openxmlformats.org/officeDocument/2006/math" xmlns:v="urn:schemas-microsoft-com:vml" xmlns:wp="http://schemas.openxmlformats.org/drawingml/2006/wordprocessingDrawing" xmlns:w10="urn:schemas-microsoft-com:office:word" xmlns:w="http://schemas.openxmlformats.org/wordprocessingml/2006/main" xmlns:wne="http://schemas.microsoft.com/office/word/2006/wordml">
+<w:endnotes xmlns:wpc="http://schemas.microsoft.com/office/word/2010/wordprocessingCanvas" xmlns:cx="http://schemas.microsoft.com/office/drawing/2014/chartex" xmlns:cx1="http://schemas.microsoft.com/office/drawing/2015/9/8/chartex" xmlns:cx2="http://schemas.microsoft.com/office/drawing/2015/10/21/chartex" xmlns:cx3="http://schemas.microsoft.com/office/drawing/2016/5/9/chartex" xmlns:cx4="http://schemas.microsoft.com/office/drawing/2016/5/10/chartex" xmlns:cx5="http://schemas.microsoft.com/office/drawing/2016/5/11/chartex" xmlns:cx6="http://schemas.microsoft.com/office/drawing/2016/5/12/chartex" xmlns:cx7="http://schemas.microsoft.com/office/drawing/2016/5/13/chartex" xmlns:cx8="http://schemas.microsoft.com/office/drawing/2016/5/14/chartex" xmlns:mc="http://schemas.openxmlformats.org/markup-compatibility/2006" xmlns:aink="http://schemas.microsoft.com/office/drawing/2016/ink" xmlns:am3d="http://schemas.microsoft.com/office/drawing/2017/model3d" xmlns:o="urn:schemas-microsoft-com:office:office" xmlns:oel="http://schemas.microsoft.com/office/2019/extlst" xmlns:r="http://schemas.openxmlformats.org/officeDocument/2006/relationships" xmlns:m="http://schemas.openxmlformats.org/officeDocument/2006/math" xmlns:v="urn:schemas-microsoft-com:vml" xmlns:wp14="http://schemas.microsoft.com/office/word/2010/wordprocessingDrawing" xmlns:wp="http://schemas.openxmlformats.org/drawingml/2006/wordprocessingDrawing" xmlns:w10="urn:schemas-microsoft-com:office:word" xmlns:w="http://schemas.openxmlformats.org/wordprocessingml/2006/main" xmlns:w14="http://schemas.microsoft.com/office/word/2010/wordml" xmlns:w15="http://schemas.microsoft.com/office/word/2012/wordml" xmlns:w16cex="http://schemas.microsoft.com/office/word/2018/wordml/cex" xmlns:w16cid="http://schemas.microsoft.com/office/word/2016/wordml/cid" xmlns:w16="http://schemas.microsoft.com/office/word/2018/wordml" xmlns:w16du="http://schemas.microsoft.com/office/word/2023/wordml/word16du" xmlns:w16sdtdh="http://schemas.microsoft.com/office/word/2020/wordml/sdtdatahash" xmlns:w16sdtfl="http://schemas.microsoft.com/office/word/2024/wordml/sdtformatlock" xmlns:w16se="http://schemas.microsoft.com/office/word/2015/wordml/symex" xmlns:wpg="http://schemas.microsoft.com/office/word/2010/wordprocessingGroup" xmlns:wpi="http://schemas.microsoft.com/office/word/2010/wordprocessingInk" xmlns:wne="http://schemas.microsoft.com/office/word/2006/wordml" xmlns:wps="http://schemas.microsoft.com/office/word/2010/wordprocessingShape" mc:Ignorable="w14 w15 w16se w16cid w16 w16cex w16sdtdh w16sdtfl w16du wp14">
   <w:endnote w:type="separator" w:id="-1">
     <w:p>
       <w:r>
@@ -1659,7 +1095,7 @@
 </file>
 
 <file path=word/footer1.xml><?xml version="1.0" encoding="utf-8"?>
-<w:ftr xmlns:ve="http://schemas.openxmlformats.org/markup-compatibility/2006" xmlns:o="urn:schemas-microsoft-com:office:office" xmlns:r="http://schemas.openxmlformats.org/officeDocument/2006/relationships" xmlns:m="http://schemas.openxmlformats.org/officeDocument/2006/math" xmlns:v="urn:schemas-microsoft-com:vml" xmlns:wp="http://schemas.openxmlformats.org/drawingml/2006/wordprocessingDrawing" xmlns:w10="urn:schemas-microsoft-com:office:word" xmlns:w="http://schemas.openxmlformats.org/wordprocessingml/2006/main" xmlns:wne="http://schemas.microsoft.com/office/word/2006/wordml">
+<w:ftr xmlns:wpc="http://schemas.microsoft.com/office/word/2010/wordprocessingCanvas" xmlns:cx="http://schemas.microsoft.com/office/drawing/2014/chartex" xmlns:cx1="http://schemas.microsoft.com/office/drawing/2015/9/8/chartex" xmlns:cx2="http://schemas.microsoft.com/office/drawing/2015/10/21/chartex" xmlns:cx3="http://schemas.microsoft.com/office/drawing/2016/5/9/chartex" xmlns:cx4="http://schemas.microsoft.com/office/drawing/2016/5/10/chartex" xmlns:cx5="http://schemas.microsoft.com/office/drawing/2016/5/11/chartex" xmlns:cx6="http://schemas.microsoft.com/office/drawing/2016/5/12/chartex" xmlns:cx7="http://schemas.microsoft.com/office/drawing/2016/5/13/chartex" xmlns:cx8="http://schemas.microsoft.com/office/drawing/2016/5/14/chartex" xmlns:mc="http://schemas.openxmlformats.org/markup-compatibility/2006" xmlns:aink="http://schemas.microsoft.com/office/drawing/2016/ink" xmlns:am3d="http://schemas.microsoft.com/office/drawing/2017/model3d" xmlns:o="urn:schemas-microsoft-com:office:office" xmlns:oel="http://schemas.microsoft.com/office/2019/extlst" xmlns:r="http://schemas.openxmlformats.org/officeDocument/2006/relationships" xmlns:m="http://schemas.openxmlformats.org/officeDocument/2006/math" xmlns:v="urn:schemas-microsoft-com:vml" xmlns:wp14="http://schemas.microsoft.com/office/word/2010/wordprocessingDrawing" xmlns:wp="http://schemas.openxmlformats.org/drawingml/2006/wordprocessingDrawing" xmlns:w10="urn:schemas-microsoft-com:office:word" xmlns:w="http://schemas.openxmlformats.org/wordprocessingml/2006/main" xmlns:w14="http://schemas.microsoft.com/office/word/2010/wordml" xmlns:w15="http://schemas.microsoft.com/office/word/2012/wordml" xmlns:w16cex="http://schemas.microsoft.com/office/word/2018/wordml/cex" xmlns:w16cid="http://schemas.microsoft.com/office/word/2016/wordml/cid" xmlns:w16="http://schemas.microsoft.com/office/word/2018/wordml" xmlns:w16du="http://schemas.microsoft.com/office/word/2023/wordml/word16du" xmlns:w16sdtdh="http://schemas.microsoft.com/office/word/2020/wordml/sdtdatahash" xmlns:w16sdtfl="http://schemas.microsoft.com/office/word/2024/wordml/sdtformatlock" xmlns:w16se="http://schemas.microsoft.com/office/word/2015/wordml/symex" xmlns:wpg="http://schemas.microsoft.com/office/word/2010/wordprocessingGroup" xmlns:wpi="http://schemas.microsoft.com/office/word/2010/wordprocessingInk" xmlns:wne="http://schemas.microsoft.com/office/word/2006/wordml" xmlns:wps="http://schemas.microsoft.com/office/word/2010/wordprocessingShape" mc:Ignorable="w14 w15 w16se w16cid w16 w16cex w16sdtdh w16sdtfl w16du wp14">
   <w:p>
     <w:pPr>
       <w:pStyle w:val="Rodap"/>
@@ -1673,7 +1109,7 @@
 </file>
 
 <file path=word/footer2.xml><?xml version="1.0" encoding="utf-8"?>
-<w:ftr xmlns:ve="http://schemas.openxmlformats.org/markup-compatibility/2006" xmlns:o="urn:schemas-microsoft-com:office:office" xmlns:r="http://schemas.openxmlformats.org/officeDocument/2006/relationships" xmlns:m="http://schemas.openxmlformats.org/officeDocument/2006/math" xmlns:v="urn:schemas-microsoft-com:vml" xmlns:wp="http://schemas.openxmlformats.org/drawingml/2006/wordprocessingDrawing" xmlns:w10="urn:schemas-microsoft-com:office:word" xmlns:w="http://schemas.openxmlformats.org/wordprocessingml/2006/main" xmlns:wne="http://schemas.microsoft.com/office/word/2006/wordml">
+<w:ftr xmlns:wpc="http://schemas.microsoft.com/office/word/2010/wordprocessingCanvas" xmlns:cx="http://schemas.microsoft.com/office/drawing/2014/chartex" xmlns:cx1="http://schemas.microsoft.com/office/drawing/2015/9/8/chartex" xmlns:cx2="http://schemas.microsoft.com/office/drawing/2015/10/21/chartex" xmlns:cx3="http://schemas.microsoft.com/office/drawing/2016/5/9/chartex" xmlns:cx4="http://schemas.microsoft.com/office/drawing/2016/5/10/chartex" xmlns:cx5="http://schemas.microsoft.com/office/drawing/2016/5/11/chartex" xmlns:cx6="http://schemas.microsoft.com/office/drawing/2016/5/12/chartex" xmlns:cx7="http://schemas.microsoft.com/office/drawing/2016/5/13/chartex" xmlns:cx8="http://schemas.microsoft.com/office/drawing/2016/5/14/chartex" xmlns:mc="http://schemas.openxmlformats.org/markup-compatibility/2006" xmlns:aink="http://schemas.microsoft.com/office/drawing/2016/ink" xmlns:am3d="http://schemas.microsoft.com/office/drawing/2017/model3d" xmlns:o="urn:schemas-microsoft-com:office:office" xmlns:oel="http://schemas.microsoft.com/office/2019/extlst" xmlns:r="http://schemas.openxmlformats.org/officeDocument/2006/relationships" xmlns:m="http://schemas.openxmlformats.org/officeDocument/2006/math" xmlns:v="urn:schemas-microsoft-com:vml" xmlns:wp14="http://schemas.microsoft.com/office/word/2010/wordprocessingDrawing" xmlns:wp="http://schemas.openxmlformats.org/drawingml/2006/wordprocessingDrawing" xmlns:w10="urn:schemas-microsoft-com:office:word" xmlns:w="http://schemas.openxmlformats.org/wordprocessingml/2006/main" xmlns:w14="http://schemas.microsoft.com/office/word/2010/wordml" xmlns:w15="http://schemas.microsoft.com/office/word/2012/wordml" xmlns:w16cex="http://schemas.microsoft.com/office/word/2018/wordml/cex" xmlns:w16cid="http://schemas.microsoft.com/office/word/2016/wordml/cid" xmlns:w16="http://schemas.microsoft.com/office/word/2018/wordml" xmlns:w16du="http://schemas.microsoft.com/office/word/2023/wordml/word16du" xmlns:w16sdtdh="http://schemas.microsoft.com/office/word/2020/wordml/sdtdatahash" xmlns:w16sdtfl="http://schemas.microsoft.com/office/word/2024/wordml/sdtformatlock" xmlns:w16se="http://schemas.microsoft.com/office/word/2015/wordml/symex" xmlns:wpg="http://schemas.microsoft.com/office/word/2010/wordprocessingGroup" xmlns:wpi="http://schemas.microsoft.com/office/word/2010/wordprocessingInk" xmlns:wne="http://schemas.microsoft.com/office/word/2006/wordml" xmlns:wps="http://schemas.microsoft.com/office/word/2010/wordprocessingShape" mc:Ignorable="w14 w15 w16se w16cid w16 w16cex w16sdtdh w16sdtfl w16du wp14">
   <w:p>
     <w:pPr>
       <w:pStyle w:val="Rodap"/>
@@ -1687,7 +1123,7 @@
 </file>
 
 <file path=word/footnotes.xml><?xml version="1.0" encoding="utf-8"?>
-<w:footnotes xmlns:ve="http://schemas.openxmlformats.org/markup-compatibility/2006" xmlns:o="urn:schemas-microsoft-com:office:office" xmlns:r="http://schemas.openxmlformats.org/officeDocument/2006/relationships" xmlns:m="http://schemas.openxmlformats.org/officeDocument/2006/math" xmlns:v="urn:schemas-microsoft-com:vml" xmlns:wp="http://schemas.openxmlformats.org/drawingml/2006/wordprocessingDrawing" xmlns:w10="urn:schemas-microsoft-com:office:word" xmlns:w="http://schemas.openxmlformats.org/wordprocessingml/2006/main" xmlns:wne="http://schemas.microsoft.com/office/word/2006/wordml">
+<w:footnotes xmlns:wpc="http://schemas.microsoft.com/office/word/2010/wordprocessingCanvas" xmlns:cx="http://schemas.microsoft.com/office/drawing/2014/chartex" xmlns:cx1="http://schemas.microsoft.com/office/drawing/2015/9/8/chartex" xmlns:cx2="http://schemas.microsoft.com/office/drawing/2015/10/21/chartex" xmlns:cx3="http://schemas.microsoft.com/office/drawing/2016/5/9/chartex" xmlns:cx4="http://schemas.microsoft.com/office/drawing/2016/5/10/chartex" xmlns:cx5="http://schemas.microsoft.com/office/drawing/2016/5/11/chartex" xmlns:cx6="http://schemas.microsoft.com/office/drawing/2016/5/12/chartex" xmlns:cx7="http://schemas.microsoft.com/office/drawing/2016/5/13/chartex" xmlns:cx8="http://schemas.microsoft.com/office/drawing/2016/5/14/chartex" xmlns:mc="http://schemas.openxmlformats.org/markup-compatibility/2006" xmlns:aink="http://schemas.microsoft.com/office/drawing/2016/ink" xmlns:am3d="http://schemas.microsoft.com/office/drawing/2017/model3d" xmlns:o="urn:schemas-microsoft-com:office:office" xmlns:oel="http://schemas.microsoft.com/office/2019/extlst" xmlns:r="http://schemas.openxmlformats.org/officeDocument/2006/relationships" xmlns:m="http://schemas.openxmlformats.org/officeDocument/2006/math" xmlns:v="urn:schemas-microsoft-com:vml" xmlns:wp14="http://schemas.microsoft.com/office/word/2010/wordprocessingDrawing" xmlns:wp="http://schemas.openxmlformats.org/drawingml/2006/wordprocessingDrawing" xmlns:w10="urn:schemas-microsoft-com:office:word" xmlns:w="http://schemas.openxmlformats.org/wordprocessingml/2006/main" xmlns:w14="http://schemas.microsoft.com/office/word/2010/wordml" xmlns:w15="http://schemas.microsoft.com/office/word/2012/wordml" xmlns:w16cex="http://schemas.microsoft.com/office/word/2018/wordml/cex" xmlns:w16cid="http://schemas.microsoft.com/office/word/2016/wordml/cid" xmlns:w16="http://schemas.microsoft.com/office/word/2018/wordml" xmlns:w16du="http://schemas.microsoft.com/office/word/2023/wordml/word16du" xmlns:w16sdtdh="http://schemas.microsoft.com/office/word/2020/wordml/sdtdatahash" xmlns:w16sdtfl="http://schemas.microsoft.com/office/word/2024/wordml/sdtformatlock" xmlns:w16se="http://schemas.microsoft.com/office/word/2015/wordml/symex" xmlns:wpg="http://schemas.microsoft.com/office/word/2010/wordprocessingGroup" xmlns:wpi="http://schemas.microsoft.com/office/word/2010/wordprocessingInk" xmlns:wne="http://schemas.microsoft.com/office/word/2006/wordml" xmlns:wps="http://schemas.microsoft.com/office/word/2010/wordprocessingShape" mc:Ignorable="w14 w15 w16se w16cid w16 w16cex w16sdtdh w16sdtfl w16du wp14">
   <w:footnote w:type="separator" w:id="-1">
     <w:p>
       <w:r>
@@ -1706,7 +1142,7 @@
 </file>
 
 <file path=word/header1.xml><?xml version="1.0" encoding="utf-8"?>
-<w:hdr xmlns:ve="http://schemas.openxmlformats.org/markup-compatibility/2006" xmlns:o="urn:schemas-microsoft-com:office:office" xmlns:r="http://schemas.openxmlformats.org/officeDocument/2006/relationships" xmlns:m="http://schemas.openxmlformats.org/officeDocument/2006/math" xmlns:v="urn:schemas-microsoft-com:vml" xmlns:wp="http://schemas.openxmlformats.org/drawingml/2006/wordprocessingDrawing" xmlns:w10="urn:schemas-microsoft-com:office:word" xmlns:w="http://schemas.openxmlformats.org/wordprocessingml/2006/main" xmlns:wne="http://schemas.microsoft.com/office/word/2006/wordml">
+<w:hdr xmlns:wpc="http://schemas.microsoft.com/office/word/2010/wordprocessingCanvas" xmlns:cx="http://schemas.microsoft.com/office/drawing/2014/chartex" xmlns:cx1="http://schemas.microsoft.com/office/drawing/2015/9/8/chartex" xmlns:cx2="http://schemas.microsoft.com/office/drawing/2015/10/21/chartex" xmlns:cx3="http://schemas.microsoft.com/office/drawing/2016/5/9/chartex" xmlns:cx4="http://schemas.microsoft.com/office/drawing/2016/5/10/chartex" xmlns:cx5="http://schemas.microsoft.com/office/drawing/2016/5/11/chartex" xmlns:cx6="http://schemas.microsoft.com/office/drawing/2016/5/12/chartex" xmlns:cx7="http://schemas.microsoft.com/office/drawing/2016/5/13/chartex" xmlns:cx8="http://schemas.microsoft.com/office/drawing/2016/5/14/chartex" xmlns:mc="http://schemas.openxmlformats.org/markup-compatibility/2006" xmlns:aink="http://schemas.microsoft.com/office/drawing/2016/ink" xmlns:am3d="http://schemas.microsoft.com/office/drawing/2017/model3d" xmlns:o="urn:schemas-microsoft-com:office:office" xmlns:oel="http://schemas.microsoft.com/office/2019/extlst" xmlns:r="http://schemas.openxmlformats.org/officeDocument/2006/relationships" xmlns:m="http://schemas.openxmlformats.org/officeDocument/2006/math" xmlns:v="urn:schemas-microsoft-com:vml" xmlns:wp14="http://schemas.microsoft.com/office/word/2010/wordprocessingDrawing" xmlns:wp="http://schemas.openxmlformats.org/drawingml/2006/wordprocessingDrawing" xmlns:w10="urn:schemas-microsoft-com:office:word" xmlns:w="http://schemas.openxmlformats.org/wordprocessingml/2006/main" xmlns:w14="http://schemas.microsoft.com/office/word/2010/wordml" xmlns:w15="http://schemas.microsoft.com/office/word/2012/wordml" xmlns:w16cex="http://schemas.microsoft.com/office/word/2018/wordml/cex" xmlns:w16cid="http://schemas.microsoft.com/office/word/2016/wordml/cid" xmlns:w16="http://schemas.microsoft.com/office/word/2018/wordml" xmlns:w16du="http://schemas.microsoft.com/office/word/2023/wordml/word16du" xmlns:w16sdtdh="http://schemas.microsoft.com/office/word/2020/wordml/sdtdatahash" xmlns:w16sdtfl="http://schemas.microsoft.com/office/word/2024/wordml/sdtformatlock" xmlns:w16se="http://schemas.microsoft.com/office/word/2015/wordml/symex" xmlns:wpg="http://schemas.microsoft.com/office/word/2010/wordprocessingGroup" xmlns:wpi="http://schemas.microsoft.com/office/word/2010/wordprocessingInk" xmlns:wne="http://schemas.microsoft.com/office/word/2006/wordml" xmlns:wps="http://schemas.microsoft.com/office/word/2010/wordprocessingShape" mc:Ignorable="w14 w15 w16se w16cid w16 w16cex w16sdtdh w16sdtfl w16du wp14">
   <w:p>
     <w:pPr>
       <w:pStyle w:val="Cabealho"/>
@@ -1731,7 +1167,7 @@
         <w:color w:val="808080"/>
         <w:szCs w:val="16"/>
       </w:rPr>
-      <w:pict>
+      <w:pict w14:anchorId="4A762233">
         <v:shapetype id="_x0000_t75" coordsize="21600,21600" o:spt="75" o:preferrelative="t" path="m@4@5l@4@11@9@11@9@5xe" filled="f" stroked="f">
           <v:stroke joinstyle="miter"/>
           <v:formulas>
@@ -1786,10 +1222,9 @@
         <w:bCs/>
         <w:color w:val="808080"/>
         <w:szCs w:val="16"/>
-        <w:lang w:eastAsia="en-US"/>
+        <w:lang w:val="pt-BR" w:eastAsia="en-US"/>
       </w:rPr>
     </w:pPr>
-    <w:proofErr w:type="spellStart"/>
     <w:r>
       <w:rPr>
         <w:rFonts w:eastAsia="Calibri"/>
@@ -1797,117 +1232,9 @@
         <w:bCs/>
         <w:color w:val="808080"/>
         <w:szCs w:val="16"/>
-        <w:lang w:eastAsia="en-US"/>
+        <w:lang w:val="pt-BR" w:eastAsia="en-US"/>
       </w:rPr>
-      <w:t>Diretoria</w:t>
-    </w:r>
-    <w:proofErr w:type="spellEnd"/>
-    <w:r>
-      <w:rPr>
-        <w:rFonts w:eastAsia="Calibri"/>
-        <w:b/>
-        <w:bCs/>
-        <w:color w:val="808080"/>
-        <w:szCs w:val="16"/>
-        <w:lang w:eastAsia="en-US"/>
-      </w:rPr>
-      <w:t xml:space="preserve"> de </w:t>
-    </w:r>
-    <w:proofErr w:type="spellStart"/>
-    <w:r>
-      <w:rPr>
-        <w:rFonts w:eastAsia="Calibri"/>
-        <w:b/>
-        <w:bCs/>
-        <w:color w:val="808080"/>
-        <w:szCs w:val="16"/>
-        <w:lang w:eastAsia="en-US"/>
-      </w:rPr>
-      <w:t>Instrução</w:t>
-    </w:r>
-    <w:proofErr w:type="spellEnd"/>
-    <w:r>
-      <w:rPr>
-        <w:rFonts w:eastAsia="Calibri"/>
-        <w:b/>
-        <w:bCs/>
-        <w:color w:val="808080"/>
-        <w:szCs w:val="16"/>
-        <w:lang w:eastAsia="en-US"/>
-      </w:rPr>
-      <w:t xml:space="preserve"> </w:t>
-    </w:r>
-    <w:proofErr w:type="spellStart"/>
-    <w:r>
-      <w:rPr>
-        <w:rFonts w:eastAsia="Calibri"/>
-        <w:b/>
-        <w:bCs/>
-        <w:color w:val="808080"/>
-        <w:szCs w:val="16"/>
-        <w:lang w:eastAsia="en-US"/>
-      </w:rPr>
-      <w:t>Processual</w:t>
-    </w:r>
-    <w:proofErr w:type="spellEnd"/>
-    <w:r>
-      <w:rPr>
-        <w:rFonts w:eastAsia="Calibri"/>
-        <w:b/>
-        <w:bCs/>
-        <w:color w:val="808080"/>
-        <w:szCs w:val="16"/>
-        <w:lang w:eastAsia="en-US"/>
-      </w:rPr>
-      <w:t xml:space="preserve"> e </w:t>
-    </w:r>
-    <w:proofErr w:type="spellStart"/>
-    <w:r>
-      <w:rPr>
-        <w:rFonts w:eastAsia="Calibri"/>
-        <w:b/>
-        <w:bCs/>
-        <w:color w:val="808080"/>
-        <w:szCs w:val="16"/>
-        <w:lang w:eastAsia="en-US"/>
-      </w:rPr>
-      <w:t>Controle</w:t>
-    </w:r>
-    <w:proofErr w:type="spellEnd"/>
-    <w:r>
-      <w:rPr>
-        <w:rFonts w:eastAsia="Calibri"/>
-        <w:b/>
-        <w:bCs/>
-        <w:color w:val="808080"/>
-        <w:szCs w:val="16"/>
-        <w:lang w:eastAsia="en-US"/>
-      </w:rPr>
-      <w:t xml:space="preserve"> de </w:t>
-    </w:r>
-    <w:proofErr w:type="spellStart"/>
-    <w:r>
-      <w:rPr>
-        <w:rFonts w:eastAsia="Calibri"/>
-        <w:b/>
-        <w:bCs/>
-        <w:color w:val="808080"/>
-        <w:szCs w:val="16"/>
-        <w:lang w:eastAsia="en-US"/>
-      </w:rPr>
-      <w:t>Decisões</w:t>
-    </w:r>
-    <w:proofErr w:type="spellEnd"/>
-    <w:r>
-      <w:rPr>
-        <w:rFonts w:eastAsia="Calibri"/>
-        <w:b/>
-        <w:bCs/>
-        <w:color w:val="808080"/>
-        <w:szCs w:val="16"/>
-        <w:lang w:eastAsia="en-US"/>
-      </w:rPr>
-      <w:t xml:space="preserve"> – DIP</w:t>
+      <w:t>Diretoria de Instrução Processual e Controle de Decisões – DIP</w:t>
     </w:r>
   </w:p>
   <w:p>
@@ -1918,9 +1245,9 @@
       </w:tabs>
       <w:rPr>
         <w:sz w:val="40"/>
+        <w:lang w:val="pt-BR"/>
       </w:rPr>
     </w:pPr>
-    <w:proofErr w:type="spellStart"/>
     <w:r>
       <w:rPr>
         <w:rFonts w:eastAsia="Calibri"/>
@@ -1928,69 +1255,9 @@
         <w:bCs/>
         <w:color w:val="808080"/>
         <w:szCs w:val="16"/>
-        <w:lang w:eastAsia="en-US"/>
+        <w:lang w:val="pt-BR" w:eastAsia="en-US"/>
       </w:rPr>
-      <w:t>Coordenadoria</w:t>
-    </w:r>
-    <w:proofErr w:type="spellEnd"/>
-    <w:r>
-      <w:rPr>
-        <w:rFonts w:eastAsia="Calibri"/>
-        <w:b/>
-        <w:bCs/>
-        <w:color w:val="808080"/>
-        <w:szCs w:val="16"/>
-        <w:lang w:eastAsia="en-US"/>
-      </w:rPr>
-      <w:t xml:space="preserve"> de </w:t>
-    </w:r>
-    <w:proofErr w:type="spellStart"/>
-    <w:r>
-      <w:rPr>
-        <w:rFonts w:eastAsia="Calibri"/>
-        <w:b/>
-        <w:bCs/>
-        <w:color w:val="808080"/>
-        <w:szCs w:val="16"/>
-        <w:lang w:eastAsia="en-US"/>
-      </w:rPr>
-      <w:t>Controle</w:t>
-    </w:r>
-    <w:proofErr w:type="spellEnd"/>
-    <w:r>
-      <w:rPr>
-        <w:rFonts w:eastAsia="Calibri"/>
-        <w:b/>
-        <w:bCs/>
-        <w:color w:val="808080"/>
-        <w:szCs w:val="16"/>
-        <w:lang w:eastAsia="en-US"/>
-      </w:rPr>
-      <w:t xml:space="preserve"> de </w:t>
-    </w:r>
-    <w:proofErr w:type="spellStart"/>
-    <w:r>
-      <w:rPr>
-        <w:rFonts w:eastAsia="Calibri"/>
-        <w:b/>
-        <w:bCs/>
-        <w:color w:val="808080"/>
-        <w:szCs w:val="16"/>
-        <w:lang w:eastAsia="en-US"/>
-      </w:rPr>
-      <w:t>Decisões</w:t>
-    </w:r>
-    <w:proofErr w:type="spellEnd"/>
-    <w:r>
-      <w:rPr>
-        <w:rFonts w:eastAsia="Calibri"/>
-        <w:b/>
-        <w:bCs/>
-        <w:color w:val="808080"/>
-        <w:szCs w:val="16"/>
-        <w:lang w:eastAsia="en-US"/>
-      </w:rPr>
-      <w:t xml:space="preserve"> – CCD</w:t>
+      <w:t>Coordenadoria de Controle de Decisões – CCD</w:t>
     </w:r>
   </w:p>
   <w:p>
@@ -2004,7 +1271,7 @@
       <w:rPr>
         <w:lang w:eastAsia="en-US"/>
       </w:rPr>
-      <w:pict>
+      <w:pict w14:anchorId="310ACE1A">
         <v:shape id="Frame1" o:spid="_x0000_s1027" style="position:absolute;left:0;text-align:left;margin-left:18pt;margin-top:17.6pt;width:442.8pt;height:19.65pt;z-index:1;mso-wrap-style:square;v-text-anchor:top" coordsize="" o:allowincell="f" path="m,l-127,r,-127l,-127xe" filled="f" stroked="f" strokecolor="#3465a4">
           <v:fill o:detectmouseclick="t"/>
         </v:shape>
@@ -2015,7 +1282,7 @@
 </file>
 
 <file path=word/header2.xml><?xml version="1.0" encoding="utf-8"?>
-<w:hdr xmlns:ve="http://schemas.openxmlformats.org/markup-compatibility/2006" xmlns:o="urn:schemas-microsoft-com:office:office" xmlns:r="http://schemas.openxmlformats.org/officeDocument/2006/relationships" xmlns:m="http://schemas.openxmlformats.org/officeDocument/2006/math" xmlns:v="urn:schemas-microsoft-com:vml" xmlns:wp="http://schemas.openxmlformats.org/drawingml/2006/wordprocessingDrawing" xmlns:w10="urn:schemas-microsoft-com:office:word" xmlns:w="http://schemas.openxmlformats.org/wordprocessingml/2006/main" xmlns:wne="http://schemas.microsoft.com/office/word/2006/wordml">
+<w:hdr xmlns:wpc="http://schemas.microsoft.com/office/word/2010/wordprocessingCanvas" xmlns:cx="http://schemas.microsoft.com/office/drawing/2014/chartex" xmlns:cx1="http://schemas.microsoft.com/office/drawing/2015/9/8/chartex" xmlns:cx2="http://schemas.microsoft.com/office/drawing/2015/10/21/chartex" xmlns:cx3="http://schemas.microsoft.com/office/drawing/2016/5/9/chartex" xmlns:cx4="http://schemas.microsoft.com/office/drawing/2016/5/10/chartex" xmlns:cx5="http://schemas.microsoft.com/office/drawing/2016/5/11/chartex" xmlns:cx6="http://schemas.microsoft.com/office/drawing/2016/5/12/chartex" xmlns:cx7="http://schemas.microsoft.com/office/drawing/2016/5/13/chartex" xmlns:cx8="http://schemas.microsoft.com/office/drawing/2016/5/14/chartex" xmlns:mc="http://schemas.openxmlformats.org/markup-compatibility/2006" xmlns:aink="http://schemas.microsoft.com/office/drawing/2016/ink" xmlns:am3d="http://schemas.microsoft.com/office/drawing/2017/model3d" xmlns:o="urn:schemas-microsoft-com:office:office" xmlns:oel="http://schemas.microsoft.com/office/2019/extlst" xmlns:r="http://schemas.openxmlformats.org/officeDocument/2006/relationships" xmlns:m="http://schemas.openxmlformats.org/officeDocument/2006/math" xmlns:v="urn:schemas-microsoft-com:vml" xmlns:wp14="http://schemas.microsoft.com/office/word/2010/wordprocessingDrawing" xmlns:wp="http://schemas.openxmlformats.org/drawingml/2006/wordprocessingDrawing" xmlns:w10="urn:schemas-microsoft-com:office:word" xmlns:w="http://schemas.openxmlformats.org/wordprocessingml/2006/main" xmlns:w14="http://schemas.microsoft.com/office/word/2010/wordml" xmlns:w15="http://schemas.microsoft.com/office/word/2012/wordml" xmlns:w16cex="http://schemas.microsoft.com/office/word/2018/wordml/cex" xmlns:w16cid="http://schemas.microsoft.com/office/word/2016/wordml/cid" xmlns:w16="http://schemas.microsoft.com/office/word/2018/wordml" xmlns:w16du="http://schemas.microsoft.com/office/word/2023/wordml/word16du" xmlns:w16sdtdh="http://schemas.microsoft.com/office/word/2020/wordml/sdtdatahash" xmlns:w16sdtfl="http://schemas.microsoft.com/office/word/2024/wordml/sdtformatlock" xmlns:w16se="http://schemas.microsoft.com/office/word/2015/wordml/symex" xmlns:wpg="http://schemas.microsoft.com/office/word/2010/wordprocessingGroup" xmlns:wpi="http://schemas.microsoft.com/office/word/2010/wordprocessingInk" xmlns:wne="http://schemas.microsoft.com/office/word/2006/wordml" xmlns:wps="http://schemas.microsoft.com/office/word/2010/wordprocessingShape" mc:Ignorable="w14 w15 w16se w16cid w16 w16cex w16sdtdh w16sdtfl w16du wp14">
   <w:p>
     <w:pPr>
       <w:pStyle w:val="Cabealho"/>
@@ -2027,7 +1294,7 @@
       <w:rPr>
         <w:lang w:eastAsia="en-US"/>
       </w:rPr>
-      <w:pict>
+      <w:pict w14:anchorId="0691918B">
         <v:shape id="_x0000_s1025" style="position:absolute;left:0;text-align:left;margin-left:18pt;margin-top:17.6pt;width:442.8pt;height:19.65pt;z-index:2;mso-wrap-style:square;v-text-anchor:top" coordsize="" o:allowincell="f" path="m,l-127,r,-127l,-127xe" filled="f" stroked="f" strokecolor="#3465a4">
           <v:fill o:detectmouseclick="t"/>
         </v:shape>
@@ -2037,7 +1304,7 @@
       <w:rPr>
         <w:noProof/>
       </w:rPr>
-      <w:pict>
+      <w:pict w14:anchorId="198929A9">
         <v:shapetype id="_x0000_t75" coordsize="21600,21600" o:spt="75" o:preferrelative="t" path="m@4@5l@4@11@9@11@9@5xe" filled="f" stroked="f">
           <v:stroke joinstyle="miter"/>
           <v:formulas>
@@ -2068,8 +1335,8 @@
 </file>
 
 <file path=word/numbering.xml><?xml version="1.0" encoding="utf-8"?>
-<w:numbering xmlns:ve="http://schemas.openxmlformats.org/markup-compatibility/2006" xmlns:o="urn:schemas-microsoft-com:office:office" xmlns:r="http://schemas.openxmlformats.org/officeDocument/2006/relationships" xmlns:m="http://schemas.openxmlformats.org/officeDocument/2006/math" xmlns:v="urn:schemas-microsoft-com:vml" xmlns:wp="http://schemas.openxmlformats.org/drawingml/2006/wordprocessingDrawing" xmlns:w10="urn:schemas-microsoft-com:office:word" xmlns:w="http://schemas.openxmlformats.org/wordprocessingml/2006/main" xmlns:wne="http://schemas.microsoft.com/office/word/2006/wordml">
-  <w:abstractNum w:abstractNumId="0">
+<w:numbering xmlns:wpc="http://schemas.microsoft.com/office/word/2010/wordprocessingCanvas" xmlns:cx="http://schemas.microsoft.com/office/drawing/2014/chartex" xmlns:cx1="http://schemas.microsoft.com/office/drawing/2015/9/8/chartex" xmlns:cx2="http://schemas.microsoft.com/office/drawing/2015/10/21/chartex" xmlns:cx3="http://schemas.microsoft.com/office/drawing/2016/5/9/chartex" xmlns:cx4="http://schemas.microsoft.com/office/drawing/2016/5/10/chartex" xmlns:cx5="http://schemas.microsoft.com/office/drawing/2016/5/11/chartex" xmlns:cx6="http://schemas.microsoft.com/office/drawing/2016/5/12/chartex" xmlns:cx7="http://schemas.microsoft.com/office/drawing/2016/5/13/chartex" xmlns:cx8="http://schemas.microsoft.com/office/drawing/2016/5/14/chartex" xmlns:mc="http://schemas.openxmlformats.org/markup-compatibility/2006" xmlns:aink="http://schemas.microsoft.com/office/drawing/2016/ink" xmlns:am3d="http://schemas.microsoft.com/office/drawing/2017/model3d" xmlns:o="urn:schemas-microsoft-com:office:office" xmlns:oel="http://schemas.microsoft.com/office/2019/extlst" xmlns:r="http://schemas.openxmlformats.org/officeDocument/2006/relationships" xmlns:m="http://schemas.openxmlformats.org/officeDocument/2006/math" xmlns:v="urn:schemas-microsoft-com:vml" xmlns:wp14="http://schemas.microsoft.com/office/word/2010/wordprocessingDrawing" xmlns:wp="http://schemas.openxmlformats.org/drawingml/2006/wordprocessingDrawing" xmlns:w10="urn:schemas-microsoft-com:office:word" xmlns:w="http://schemas.openxmlformats.org/wordprocessingml/2006/main" xmlns:w14="http://schemas.microsoft.com/office/word/2010/wordml" xmlns:w15="http://schemas.microsoft.com/office/word/2012/wordml" xmlns:w16cex="http://schemas.microsoft.com/office/word/2018/wordml/cex" xmlns:w16cid="http://schemas.microsoft.com/office/word/2016/wordml/cid" xmlns:w16="http://schemas.microsoft.com/office/word/2018/wordml" xmlns:w16du="http://schemas.microsoft.com/office/word/2023/wordml/word16du" xmlns:w16sdtdh="http://schemas.microsoft.com/office/word/2020/wordml/sdtdatahash" xmlns:w16sdtfl="http://schemas.microsoft.com/office/word/2024/wordml/sdtformatlock" xmlns:w16se="http://schemas.microsoft.com/office/word/2015/wordml/symex" xmlns:wpg="http://schemas.microsoft.com/office/word/2010/wordprocessingGroup" xmlns:wpi="http://schemas.microsoft.com/office/word/2010/wordprocessingInk" xmlns:wne="http://schemas.microsoft.com/office/word/2006/wordml" xmlns:wps="http://schemas.microsoft.com/office/word/2010/wordprocessingShape" mc:Ignorable="w14 w15 w16se w16cid w16 w16cex w16sdtdh w16sdtfl w16du wp14">
+  <w:abstractNum w:abstractNumId="0" w15:restartNumberingAfterBreak="0">
     <w:nsid w:val="2F6C0925"/>
     <w:multiLevelType w:val="multilevel"/>
     <w:tmpl w:val="C43EEF8E"/>
@@ -2192,7 +1459,7 @@
       </w:pPr>
     </w:lvl>
   </w:abstractNum>
-  <w:abstractNum w:abstractNumId="1">
+  <w:abstractNum w:abstractNumId="1" w15:restartNumberingAfterBreak="0">
     <w:nsid w:val="6DCA3050"/>
     <w:multiLevelType w:val="multilevel"/>
     <w:tmpl w:val="420AE810"/>
@@ -2314,17 +1581,17 @@
       </w:pPr>
     </w:lvl>
   </w:abstractNum>
-  <w:num w:numId="1">
+  <w:num w:numId="1" w16cid:durableId="1026633671">
     <w:abstractNumId w:val="0"/>
   </w:num>
-  <w:num w:numId="2">
+  <w:num w:numId="2" w16cid:durableId="1064062186">
     <w:abstractNumId w:val="1"/>
   </w:num>
 </w:numbering>
 </file>
 
 <file path=word/styles.xml><?xml version="1.0" encoding="utf-8"?>
-<w:styles xmlns:r="http://schemas.openxmlformats.org/officeDocument/2006/relationships" xmlns:w="http://schemas.openxmlformats.org/wordprocessingml/2006/main">
+<w:styles xmlns:mc="http://schemas.openxmlformats.org/markup-compatibility/2006" xmlns:r="http://schemas.openxmlformats.org/officeDocument/2006/relationships" xmlns:w="http://schemas.openxmlformats.org/wordprocessingml/2006/main" xmlns:w14="http://schemas.microsoft.com/office/word/2010/wordml" xmlns:w15="http://schemas.microsoft.com/office/word/2012/wordml" xmlns:w16cex="http://schemas.microsoft.com/office/word/2018/wordml/cex" xmlns:w16cid="http://schemas.microsoft.com/office/word/2016/wordml/cid" xmlns:w16="http://schemas.microsoft.com/office/word/2018/wordml" xmlns:w16du="http://schemas.microsoft.com/office/word/2023/wordml/word16du" xmlns:w16sdtdh="http://schemas.microsoft.com/office/word/2020/wordml/sdtdatahash" xmlns:w16sdtfl="http://schemas.microsoft.com/office/word/2024/wordml/sdtformatlock" xmlns:w16se="http://schemas.microsoft.com/office/word/2015/wordml/symex" mc:Ignorable="w14 w15 w16se w16cid w16 w16cex w16sdtdh w16sdtfl w16du">
   <w:docDefaults>
     <w:rPrDefault>
       <w:rPr>
@@ -2334,144 +1601,383 @@
     </w:rPrDefault>
     <w:pPrDefault/>
   </w:docDefaults>
-  <w:latentStyles w:defLockedState="0" w:defUIPriority="99" w:defSemiHidden="1" w:defUnhideWhenUsed="1" w:defQFormat="0" w:count="267">
-    <w:lsdException w:name="Normal" w:semiHidden="0" w:uiPriority="0" w:unhideWhenUsed="0" w:qFormat="1"/>
-    <w:lsdException w:name="heading 1" w:semiHidden="0" w:uiPriority="9" w:unhideWhenUsed="0" w:qFormat="1"/>
-    <w:lsdException w:name="heading 2" w:uiPriority="9" w:qFormat="1"/>
-    <w:lsdException w:name="heading 3" w:uiPriority="9" w:qFormat="1"/>
-    <w:lsdException w:name="heading 4" w:uiPriority="9" w:qFormat="1"/>
-    <w:lsdException w:name="heading 5" w:uiPriority="9" w:qFormat="1"/>
-    <w:lsdException w:name="heading 6" w:uiPriority="9" w:qFormat="1"/>
-    <w:lsdException w:name="heading 7" w:uiPriority="9" w:qFormat="1"/>
-    <w:lsdException w:name="heading 8" w:uiPriority="9" w:qFormat="1"/>
-    <w:lsdException w:name="heading 9" w:uiPriority="9" w:qFormat="1"/>
-    <w:lsdException w:name="toc 1" w:uiPriority="39"/>
-    <w:lsdException w:name="toc 2" w:uiPriority="39"/>
-    <w:lsdException w:name="toc 3" w:uiPriority="39"/>
-    <w:lsdException w:name="toc 4" w:uiPriority="39"/>
-    <w:lsdException w:name="toc 5" w:uiPriority="39"/>
-    <w:lsdException w:name="toc 6" w:uiPriority="39"/>
-    <w:lsdException w:name="toc 7" w:uiPriority="39"/>
-    <w:lsdException w:name="toc 8" w:uiPriority="39"/>
-    <w:lsdException w:name="toc 9" w:uiPriority="39"/>
-    <w:lsdException w:name="caption" w:uiPriority="35" w:qFormat="1"/>
-    <w:lsdException w:name="Title" w:semiHidden="0" w:uiPriority="10" w:unhideWhenUsed="0" w:qFormat="1"/>
-    <w:lsdException w:name="Default Paragraph Font" w:uiPriority="1"/>
-    <w:lsdException w:name="Subtitle" w:semiHidden="0" w:uiPriority="11" w:unhideWhenUsed="0" w:qFormat="1"/>
-    <w:lsdException w:name="Strong" w:semiHidden="0" w:uiPriority="22" w:unhideWhenUsed="0" w:qFormat="1"/>
-    <w:lsdException w:name="Emphasis" w:semiHidden="0" w:uiPriority="20" w:unhideWhenUsed="0" w:qFormat="1"/>
-    <w:lsdException w:name="Table Grid" w:semiHidden="0" w:uiPriority="59" w:unhideWhenUsed="0"/>
-    <w:lsdException w:name="Placeholder Text" w:unhideWhenUsed="0"/>
-    <w:lsdException w:name="No Spacing" w:semiHidden="0" w:uiPriority="1" w:unhideWhenUsed="0" w:qFormat="1"/>
-    <w:lsdException w:name="Light Shading" w:semiHidden="0" w:uiPriority="60" w:unhideWhenUsed="0"/>
-    <w:lsdException w:name="Light List" w:semiHidden="0" w:uiPriority="61" w:unhideWhenUsed="0"/>
-    <w:lsdException w:name="Light Grid" w:semiHidden="0" w:uiPriority="62" w:unhideWhenUsed="0"/>
-    <w:lsdException w:name="Medium Shading 1" w:semiHidden="0" w:uiPriority="63" w:unhideWhenUsed="0"/>
-    <w:lsdException w:name="Medium Shading 2" w:semiHidden="0" w:uiPriority="64" w:unhideWhenUsed="0"/>
-    <w:lsdException w:name="Medium List 1" w:semiHidden="0" w:uiPriority="65" w:unhideWhenUsed="0"/>
-    <w:lsdException w:name="Medium List 2" w:semiHidden="0" w:uiPriority="66" w:unhideWhenUsed="0"/>
-    <w:lsdException w:name="Medium Grid 1" w:semiHidden="0" w:uiPriority="67" w:unhideWhenUsed="0"/>
-    <w:lsdException w:name="Medium Grid 2" w:semiHidden="0" w:uiPriority="68" w:unhideWhenUsed="0"/>
-    <w:lsdException w:name="Medium Grid 3" w:semiHidden="0" w:uiPriority="69" w:unhideWhenUsed="0"/>
-    <w:lsdException w:name="Dark List" w:semiHidden="0" w:uiPriority="70" w:unhideWhenUsed="0"/>
-    <w:lsdException w:name="Colorful Shading" w:semiHidden="0" w:uiPriority="71" w:unhideWhenUsed="0"/>
-    <w:lsdException w:name="Colorful List" w:semiHidden="0" w:uiPriority="72" w:unhideWhenUsed="0"/>
-    <w:lsdException w:name="Colorful Grid" w:semiHidden="0" w:uiPriority="73" w:unhideWhenUsed="0"/>
-    <w:lsdException w:name="Light Shading Accent 1" w:semiHidden="0" w:uiPriority="60" w:unhideWhenUsed="0"/>
-    <w:lsdException w:name="Light List Accent 1" w:semiHidden="0" w:uiPriority="61" w:unhideWhenUsed="0"/>
-    <w:lsdException w:name="Light Grid Accent 1" w:semiHidden="0" w:uiPriority="62" w:unhideWhenUsed="0"/>
-    <w:lsdException w:name="Medium Shading 1 Accent 1" w:semiHidden="0" w:uiPriority="63" w:unhideWhenUsed="0"/>
-    <w:lsdException w:name="Medium Shading 2 Accent 1" w:semiHidden="0" w:uiPriority="64" w:unhideWhenUsed="0"/>
-    <w:lsdException w:name="Medium List 1 Accent 1" w:semiHidden="0" w:uiPriority="65" w:unhideWhenUsed="0"/>
-    <w:lsdException w:name="Revision" w:unhideWhenUsed="0"/>
-    <w:lsdException w:name="List Paragraph" w:semiHidden="0" w:uiPriority="34" w:unhideWhenUsed="0" w:qFormat="1"/>
-    <w:lsdException w:name="Quote" w:semiHidden="0" w:uiPriority="29" w:unhideWhenUsed="0" w:qFormat="1"/>
-    <w:lsdException w:name="Intense Quote" w:semiHidden="0" w:uiPriority="30" w:unhideWhenUsed="0" w:qFormat="1"/>
-    <w:lsdException w:name="Medium List 2 Accent 1" w:semiHidden="0" w:uiPriority="66" w:unhideWhenUsed="0"/>
-    <w:lsdException w:name="Medium Grid 1 Accent 1" w:semiHidden="0" w:uiPriority="67" w:unhideWhenUsed="0"/>
-    <w:lsdException w:name="Medium Grid 2 Accent 1" w:semiHidden="0" w:uiPriority="68" w:unhideWhenUsed="0"/>
-    <w:lsdException w:name="Medium Grid 3 Accent 1" w:semiHidden="0" w:uiPriority="69" w:unhideWhenUsed="0"/>
-    <w:lsdException w:name="Dark List Accent 1" w:semiHidden="0" w:uiPriority="70" w:unhideWhenUsed="0"/>
-    <w:lsdException w:name="Colorful Shading Accent 1" w:semiHidden="0" w:uiPriority="71" w:unhideWhenUsed="0"/>
-    <w:lsdException w:name="Colorful List Accent 1" w:semiHidden="0" w:uiPriority="72" w:unhideWhenUsed="0"/>
-    <w:lsdException w:name="Colorful Grid Accent 1" w:semiHidden="0" w:uiPriority="73" w:unhideWhenUsed="0"/>
-    <w:lsdException w:name="Light Shading Accent 2" w:semiHidden="0" w:uiPriority="60" w:unhideWhenUsed="0"/>
-    <w:lsdException w:name="Light List Accent 2" w:semiHidden="0" w:uiPriority="61" w:unhideWhenUsed="0"/>
-    <w:lsdException w:name="Light Grid Accent 2" w:semiHidden="0" w:uiPriority="62" w:unhideWhenUsed="0"/>
-    <w:lsdException w:name="Medium Shading 1 Accent 2" w:semiHidden="0" w:uiPriority="63" w:unhideWhenUsed="0"/>
-    <w:lsdException w:name="Medium Shading 2 Accent 2" w:semiHidden="0" w:uiPriority="64" w:unhideWhenUsed="0"/>
-    <w:lsdException w:name="Medium List 1 Accent 2" w:semiHidden="0" w:uiPriority="65" w:unhideWhenUsed="0"/>
-    <w:lsdException w:name="Medium List 2 Accent 2" w:semiHidden="0" w:uiPriority="66" w:unhideWhenUsed="0"/>
-    <w:lsdException w:name="Medium Grid 1 Accent 2" w:semiHidden="0" w:uiPriority="67" w:unhideWhenUsed="0"/>
-    <w:lsdException w:name="Medium Grid 2 Accent 2" w:semiHidden="0" w:uiPriority="68" w:unhideWhenUsed="0"/>
-    <w:lsdException w:name="Medium Grid 3 Accent 2" w:semiHidden="0" w:uiPriority="69" w:unhideWhenUsed="0"/>
-    <w:lsdException w:name="Dark List Accent 2" w:semiHidden="0" w:uiPriority="70" w:unhideWhenUsed="0"/>
-    <w:lsdException w:name="Colorful Shading Accent 2" w:semiHidden="0" w:uiPriority="71" w:unhideWhenUsed="0"/>
-    <w:lsdException w:name="Colorful List Accent 2" w:semiHidden="0" w:uiPriority="72" w:unhideWhenUsed="0"/>
-    <w:lsdException w:name="Colorful Grid Accent 2" w:semiHidden="0" w:uiPriority="73" w:unhideWhenUsed="0"/>
-    <w:lsdException w:name="Light Shading Accent 3" w:semiHidden="0" w:uiPriority="60" w:unhideWhenUsed="0"/>
-    <w:lsdException w:name="Light List Accent 3" w:semiHidden="0" w:uiPriority="61" w:unhideWhenUsed="0"/>
-    <w:lsdException w:name="Light Grid Accent 3" w:semiHidden="0" w:uiPriority="62" w:unhideWhenUsed="0"/>
-    <w:lsdException w:name="Medium Shading 1 Accent 3" w:semiHidden="0" w:uiPriority="63" w:unhideWhenUsed="0"/>
-    <w:lsdException w:name="Medium Shading 2 Accent 3" w:semiHidden="0" w:uiPriority="64" w:unhideWhenUsed="0"/>
-    <w:lsdException w:name="Medium List 1 Accent 3" w:semiHidden="0" w:uiPriority="65" w:unhideWhenUsed="0"/>
-    <w:lsdException w:name="Medium List 2 Accent 3" w:semiHidden="0" w:uiPriority="66" w:unhideWhenUsed="0"/>
-    <w:lsdException w:name="Medium Grid 1 Accent 3" w:semiHidden="0" w:uiPriority="67" w:unhideWhenUsed="0"/>
-    <w:lsdException w:name="Medium Grid 2 Accent 3" w:semiHidden="0" w:uiPriority="68" w:unhideWhenUsed="0"/>
-    <w:lsdException w:name="Medium Grid 3 Accent 3" w:semiHidden="0" w:uiPriority="69" w:unhideWhenUsed="0"/>
-    <w:lsdException w:name="Dark List Accent 3" w:semiHidden="0" w:uiPriority="70" w:unhideWhenUsed="0"/>
-    <w:lsdException w:name="Colorful Shading Accent 3" w:semiHidden="0" w:uiPriority="71" w:unhideWhenUsed="0"/>
-    <w:lsdException w:name="Colorful List Accent 3" w:semiHidden="0" w:uiPriority="72" w:unhideWhenUsed="0"/>
-    <w:lsdException w:name="Colorful Grid Accent 3" w:semiHidden="0" w:uiPriority="73" w:unhideWhenUsed="0"/>
-    <w:lsdException w:name="Light Shading Accent 4" w:semiHidden="0" w:uiPriority="60" w:unhideWhenUsed="0"/>
-    <w:lsdException w:name="Light List Accent 4" w:semiHidden="0" w:uiPriority="61" w:unhideWhenUsed="0"/>
-    <w:lsdException w:name="Light Grid Accent 4" w:semiHidden="0" w:uiPriority="62" w:unhideWhenUsed="0"/>
-    <w:lsdException w:name="Medium Shading 1 Accent 4" w:semiHidden="0" w:uiPriority="63" w:unhideWhenUsed="0"/>
-    <w:lsdException w:name="Medium Shading 2 Accent 4" w:semiHidden="0" w:uiPriority="64" w:unhideWhenUsed="0"/>
-    <w:lsdException w:name="Medium List 1 Accent 4" w:semiHidden="0" w:uiPriority="65" w:unhideWhenUsed="0"/>
-    <w:lsdException w:name="Medium List 2 Accent 4" w:semiHidden="0" w:uiPriority="66" w:unhideWhenUsed="0"/>
-    <w:lsdException w:name="Medium Grid 1 Accent 4" w:semiHidden="0" w:uiPriority="67" w:unhideWhenUsed="0"/>
-    <w:lsdException w:name="Medium Grid 2 Accent 4" w:semiHidden="0" w:uiPriority="68" w:unhideWhenUsed="0"/>
-    <w:lsdException w:name="Medium Grid 3 Accent 4" w:semiHidden="0" w:uiPriority="69" w:unhideWhenUsed="0"/>
-    <w:lsdException w:name="Dark List Accent 4" w:semiHidden="0" w:uiPriority="70" w:unhideWhenUsed="0"/>
-    <w:lsdException w:name="Colorful Shading Accent 4" w:semiHidden="0" w:uiPriority="71" w:unhideWhenUsed="0"/>
-    <w:lsdException w:name="Colorful List Accent 4" w:semiHidden="0" w:uiPriority="72" w:unhideWhenUsed="0"/>
-    <w:lsdException w:name="Colorful Grid Accent 4" w:semiHidden="0" w:uiPriority="73" w:unhideWhenUsed="0"/>
-    <w:lsdException w:name="Light Shading Accent 5" w:semiHidden="0" w:uiPriority="60" w:unhideWhenUsed="0"/>
-    <w:lsdException w:name="Light List Accent 5" w:semiHidden="0" w:uiPriority="61" w:unhideWhenUsed="0"/>
-    <w:lsdException w:name="Light Grid Accent 5" w:semiHidden="0" w:uiPriority="62" w:unhideWhenUsed="0"/>
-    <w:lsdException w:name="Medium Shading 1 Accent 5" w:semiHidden="0" w:uiPriority="63" w:unhideWhenUsed="0"/>
-    <w:lsdException w:name="Medium Shading 2 Accent 5" w:semiHidden="0" w:uiPriority="64" w:unhideWhenUsed="0"/>
-    <w:lsdException w:name="Medium List 1 Accent 5" w:semiHidden="0" w:uiPriority="65" w:unhideWhenUsed="0"/>
-    <w:lsdException w:name="Medium List 2 Accent 5" w:semiHidden="0" w:uiPriority="66" w:unhideWhenUsed="0"/>
-    <w:lsdException w:name="Medium Grid 1 Accent 5" w:semiHidden="0" w:uiPriority="67" w:unhideWhenUsed="0"/>
-    <w:lsdException w:name="Medium Grid 2 Accent 5" w:semiHidden="0" w:uiPriority="68" w:unhideWhenUsed="0"/>
-    <w:lsdException w:name="Medium Grid 3 Accent 5" w:semiHidden="0" w:uiPriority="69" w:unhideWhenUsed="0"/>
-    <w:lsdException w:name="Dark List Accent 5" w:semiHidden="0" w:uiPriority="70" w:unhideWhenUsed="0"/>
-    <w:lsdException w:name="Colorful Shading Accent 5" w:semiHidden="0" w:uiPriority="71" w:unhideWhenUsed="0"/>
-    <w:lsdException w:name="Colorful List Accent 5" w:semiHidden="0" w:uiPriority="72" w:unhideWhenUsed="0"/>
-    <w:lsdException w:name="Colorful Grid Accent 5" w:semiHidden="0" w:uiPriority="73" w:unhideWhenUsed="0"/>
-    <w:lsdException w:name="Light Shading Accent 6" w:semiHidden="0" w:uiPriority="60" w:unhideWhenUsed="0"/>
-    <w:lsdException w:name="Light List Accent 6" w:semiHidden="0" w:uiPriority="61" w:unhideWhenUsed="0"/>
-    <w:lsdException w:name="Light Grid Accent 6" w:semiHidden="0" w:uiPriority="62" w:unhideWhenUsed="0"/>
-    <w:lsdException w:name="Medium Shading 1 Accent 6" w:semiHidden="0" w:uiPriority="63" w:unhideWhenUsed="0"/>
-    <w:lsdException w:name="Medium Shading 2 Accent 6" w:semiHidden="0" w:uiPriority="64" w:unhideWhenUsed="0"/>
-    <w:lsdException w:name="Medium List 1 Accent 6" w:semiHidden="0" w:uiPriority="65" w:unhideWhenUsed="0"/>
-    <w:lsdException w:name="Medium List 2 Accent 6" w:semiHidden="0" w:uiPriority="66" w:unhideWhenUsed="0"/>
-    <w:lsdException w:name="Medium Grid 1 Accent 6" w:semiHidden="0" w:uiPriority="67" w:unhideWhenUsed="0"/>
-    <w:lsdException w:name="Medium Grid 2 Accent 6" w:semiHidden="0" w:uiPriority="68" w:unhideWhenUsed="0"/>
-    <w:lsdException w:name="Medium Grid 3 Accent 6" w:semiHidden="0" w:uiPriority="69" w:unhideWhenUsed="0"/>
-    <w:lsdException w:name="Dark List Accent 6" w:semiHidden="0" w:uiPriority="70" w:unhideWhenUsed="0"/>
-    <w:lsdException w:name="Colorful Shading Accent 6" w:semiHidden="0" w:uiPriority="71" w:unhideWhenUsed="0"/>
-    <w:lsdException w:name="Colorful List Accent 6" w:semiHidden="0" w:uiPriority="72" w:unhideWhenUsed="0"/>
-    <w:lsdException w:name="Colorful Grid Accent 6" w:semiHidden="0" w:uiPriority="73" w:unhideWhenUsed="0"/>
-    <w:lsdException w:name="Subtle Emphasis" w:semiHidden="0" w:uiPriority="19" w:unhideWhenUsed="0" w:qFormat="1"/>
-    <w:lsdException w:name="Intense Emphasis" w:semiHidden="0" w:uiPriority="21" w:unhideWhenUsed="0" w:qFormat="1"/>
-    <w:lsdException w:name="Subtle Reference" w:semiHidden="0" w:uiPriority="31" w:unhideWhenUsed="0" w:qFormat="1"/>
-    <w:lsdException w:name="Intense Reference" w:semiHidden="0" w:uiPriority="32" w:unhideWhenUsed="0" w:qFormat="1"/>
-    <w:lsdException w:name="Book Title" w:semiHidden="0" w:uiPriority="33" w:unhideWhenUsed="0" w:qFormat="1"/>
-    <w:lsdException w:name="Bibliography" w:uiPriority="37"/>
-    <w:lsdException w:name="TOC Heading" w:uiPriority="39" w:qFormat="1"/>
+  <w:latentStyles w:defLockedState="0" w:defUIPriority="99" w:defSemiHidden="0" w:defUnhideWhenUsed="0" w:defQFormat="0" w:count="376">
+    <w:lsdException w:name="Normal" w:uiPriority="0" w:qFormat="1"/>
+    <w:lsdException w:name="heading 1" w:uiPriority="9" w:qFormat="1"/>
+    <w:lsdException w:name="heading 2" w:semiHidden="1" w:uiPriority="9" w:unhideWhenUsed="1" w:qFormat="1"/>
+    <w:lsdException w:name="heading 3" w:semiHidden="1" w:uiPriority="9" w:unhideWhenUsed="1" w:qFormat="1"/>
+    <w:lsdException w:name="heading 4" w:semiHidden="1" w:uiPriority="9" w:unhideWhenUsed="1" w:qFormat="1"/>
+    <w:lsdException w:name="heading 5" w:semiHidden="1" w:uiPriority="9" w:unhideWhenUsed="1" w:qFormat="1"/>
+    <w:lsdException w:name="heading 6" w:semiHidden="1" w:uiPriority="9" w:unhideWhenUsed="1" w:qFormat="1"/>
+    <w:lsdException w:name="heading 7" w:semiHidden="1" w:uiPriority="9" w:unhideWhenUsed="1" w:qFormat="1"/>
+    <w:lsdException w:name="heading 8" w:semiHidden="1" w:uiPriority="9" w:unhideWhenUsed="1" w:qFormat="1"/>
+    <w:lsdException w:name="heading 9" w:semiHidden="1" w:uiPriority="9" w:unhideWhenUsed="1" w:qFormat="1"/>
+    <w:lsdException w:name="index 1" w:semiHidden="1" w:unhideWhenUsed="1"/>
+    <w:lsdException w:name="index 2" w:semiHidden="1" w:unhideWhenUsed="1"/>
+    <w:lsdException w:name="index 3" w:semiHidden="1" w:unhideWhenUsed="1"/>
+    <w:lsdException w:name="index 4" w:semiHidden="1" w:unhideWhenUsed="1"/>
+    <w:lsdException w:name="index 5" w:semiHidden="1" w:unhideWhenUsed="1"/>
+    <w:lsdException w:name="index 6" w:semiHidden="1" w:unhideWhenUsed="1"/>
+    <w:lsdException w:name="index 7" w:semiHidden="1" w:unhideWhenUsed="1"/>
+    <w:lsdException w:name="index 8" w:semiHidden="1" w:unhideWhenUsed="1"/>
+    <w:lsdException w:name="index 9" w:semiHidden="1" w:unhideWhenUsed="1"/>
+    <w:lsdException w:name="toc 1" w:semiHidden="1" w:uiPriority="39" w:unhideWhenUsed="1"/>
+    <w:lsdException w:name="toc 2" w:semiHidden="1" w:uiPriority="39" w:unhideWhenUsed="1"/>
+    <w:lsdException w:name="toc 3" w:semiHidden="1" w:uiPriority="39" w:unhideWhenUsed="1"/>
+    <w:lsdException w:name="toc 4" w:semiHidden="1" w:uiPriority="39" w:unhideWhenUsed="1"/>
+    <w:lsdException w:name="toc 5" w:semiHidden="1" w:uiPriority="39" w:unhideWhenUsed="1"/>
+    <w:lsdException w:name="toc 6" w:semiHidden="1" w:uiPriority="39" w:unhideWhenUsed="1"/>
+    <w:lsdException w:name="toc 7" w:semiHidden="1" w:uiPriority="39" w:unhideWhenUsed="1"/>
+    <w:lsdException w:name="toc 8" w:semiHidden="1" w:uiPriority="39" w:unhideWhenUsed="1"/>
+    <w:lsdException w:name="toc 9" w:semiHidden="1" w:uiPriority="39" w:unhideWhenUsed="1"/>
+    <w:lsdException w:name="Normal Indent" w:semiHidden="1" w:unhideWhenUsed="1"/>
+    <w:lsdException w:name="footnote text" w:semiHidden="1" w:unhideWhenUsed="1"/>
+    <w:lsdException w:name="annotation text" w:semiHidden="1" w:unhideWhenUsed="1"/>
+    <w:lsdException w:name="header" w:semiHidden="1" w:unhideWhenUsed="1"/>
+    <w:lsdException w:name="footer" w:semiHidden="1" w:unhideWhenUsed="1"/>
+    <w:lsdException w:name="index heading" w:semiHidden="1" w:unhideWhenUsed="1"/>
+    <w:lsdException w:name="caption" w:semiHidden="1" w:uiPriority="35" w:unhideWhenUsed="1" w:qFormat="1"/>
+    <w:lsdException w:name="table of figures" w:semiHidden="1" w:unhideWhenUsed="1"/>
+    <w:lsdException w:name="envelope address" w:semiHidden="1" w:unhideWhenUsed="1"/>
+    <w:lsdException w:name="envelope return" w:semiHidden="1" w:unhideWhenUsed="1"/>
+    <w:lsdException w:name="footnote reference" w:semiHidden="1" w:unhideWhenUsed="1"/>
+    <w:lsdException w:name="annotation reference" w:semiHidden="1" w:unhideWhenUsed="1"/>
+    <w:lsdException w:name="line number" w:semiHidden="1" w:unhideWhenUsed="1"/>
+    <w:lsdException w:name="page number" w:semiHidden="1" w:unhideWhenUsed="1"/>
+    <w:lsdException w:name="endnote reference" w:semiHidden="1" w:unhideWhenUsed="1"/>
+    <w:lsdException w:name="endnote text" w:semiHidden="1" w:unhideWhenUsed="1"/>
+    <w:lsdException w:name="table of authorities" w:semiHidden="1" w:unhideWhenUsed="1"/>
+    <w:lsdException w:name="macro" w:semiHidden="1" w:unhideWhenUsed="1"/>
+    <w:lsdException w:name="toa heading" w:semiHidden="1" w:unhideWhenUsed="1"/>
+    <w:lsdException w:name="List" w:semiHidden="1" w:unhideWhenUsed="1"/>
+    <w:lsdException w:name="List Bullet" w:semiHidden="1" w:unhideWhenUsed="1"/>
+    <w:lsdException w:name="List Number" w:semiHidden="1" w:unhideWhenUsed="1"/>
+    <w:lsdException w:name="List 2" w:semiHidden="1" w:unhideWhenUsed="1"/>
+    <w:lsdException w:name="List 3" w:semiHidden="1" w:unhideWhenUsed="1"/>
+    <w:lsdException w:name="List 4" w:semiHidden="1" w:unhideWhenUsed="1"/>
+    <w:lsdException w:name="List 5" w:semiHidden="1" w:unhideWhenUsed="1"/>
+    <w:lsdException w:name="List Bullet 2" w:semiHidden="1" w:unhideWhenUsed="1"/>
+    <w:lsdException w:name="List Bullet 3" w:semiHidden="1" w:unhideWhenUsed="1"/>
+    <w:lsdException w:name="List Bullet 4" w:semiHidden="1" w:unhideWhenUsed="1"/>
+    <w:lsdException w:name="List Bullet 5" w:semiHidden="1" w:unhideWhenUsed="1"/>
+    <w:lsdException w:name="List Number 2" w:semiHidden="1" w:unhideWhenUsed="1"/>
+    <w:lsdException w:name="List Number 3" w:semiHidden="1" w:unhideWhenUsed="1"/>
+    <w:lsdException w:name="List Number 4" w:semiHidden="1" w:unhideWhenUsed="1"/>
+    <w:lsdException w:name="List Number 5" w:semiHidden="1" w:unhideWhenUsed="1"/>
+    <w:lsdException w:name="Title" w:uiPriority="10" w:qFormat="1"/>
+    <w:lsdException w:name="Closing" w:semiHidden="1" w:unhideWhenUsed="1"/>
+    <w:lsdException w:name="Signature" w:semiHidden="1" w:unhideWhenUsed="1"/>
+    <w:lsdException w:name="Default Paragraph Font" w:semiHidden="1" w:uiPriority="1" w:unhideWhenUsed="1"/>
+    <w:lsdException w:name="Body Text" w:semiHidden="1" w:unhideWhenUsed="1"/>
+    <w:lsdException w:name="Body Text Indent" w:semiHidden="1" w:unhideWhenUsed="1"/>
+    <w:lsdException w:name="List Continue" w:semiHidden="1" w:unhideWhenUsed="1"/>
+    <w:lsdException w:name="List Continue 2" w:semiHidden="1" w:unhideWhenUsed="1"/>
+    <w:lsdException w:name="List Continue 3" w:semiHidden="1" w:unhideWhenUsed="1"/>
+    <w:lsdException w:name="List Continue 4" w:semiHidden="1" w:unhideWhenUsed="1"/>
+    <w:lsdException w:name="List Continue 5" w:semiHidden="1" w:unhideWhenUsed="1"/>
+    <w:lsdException w:name="Message Header" w:semiHidden="1" w:unhideWhenUsed="1"/>
+    <w:lsdException w:name="Subtitle" w:uiPriority="11" w:qFormat="1"/>
+    <w:lsdException w:name="Salutation" w:semiHidden="1" w:unhideWhenUsed="1"/>
+    <w:lsdException w:name="Date" w:semiHidden="1" w:unhideWhenUsed="1"/>
+    <w:lsdException w:name="Body Text First Indent" w:semiHidden="1" w:unhideWhenUsed="1"/>
+    <w:lsdException w:name="Body Text First Indent 2" w:semiHidden="1" w:unhideWhenUsed="1"/>
+    <w:lsdException w:name="Note Heading" w:semiHidden="1" w:unhideWhenUsed="1"/>
+    <w:lsdException w:name="Body Text 2" w:semiHidden="1" w:unhideWhenUsed="1"/>
+    <w:lsdException w:name="Body Text 3" w:semiHidden="1" w:unhideWhenUsed="1"/>
+    <w:lsdException w:name="Body Text Indent 2" w:semiHidden="1" w:unhideWhenUsed="1"/>
+    <w:lsdException w:name="Body Text Indent 3" w:semiHidden="1" w:unhideWhenUsed="1"/>
+    <w:lsdException w:name="Block Text" w:semiHidden="1" w:unhideWhenUsed="1"/>
+    <w:lsdException w:name="Hyperlink" w:semiHidden="1" w:unhideWhenUsed="1"/>
+    <w:lsdException w:name="FollowedHyperlink" w:semiHidden="1" w:unhideWhenUsed="1"/>
+    <w:lsdException w:name="Strong" w:uiPriority="22" w:qFormat="1"/>
+    <w:lsdException w:name="Emphasis" w:uiPriority="20" w:qFormat="1"/>
+    <w:lsdException w:name="Document Map" w:semiHidden="1" w:unhideWhenUsed="1"/>
+    <w:lsdException w:name="Plain Text" w:semiHidden="1" w:unhideWhenUsed="1"/>
+    <w:lsdException w:name="E-mail Signature" w:semiHidden="1" w:unhideWhenUsed="1"/>
+    <w:lsdException w:name="HTML Top of Form" w:semiHidden="1" w:unhideWhenUsed="1"/>
+    <w:lsdException w:name="HTML Bottom of Form" w:semiHidden="1" w:unhideWhenUsed="1"/>
+    <w:lsdException w:name="Normal (Web)" w:semiHidden="1" w:unhideWhenUsed="1"/>
+    <w:lsdException w:name="HTML Acronym" w:semiHidden="1" w:unhideWhenUsed="1"/>
+    <w:lsdException w:name="HTML Address" w:semiHidden="1" w:unhideWhenUsed="1"/>
+    <w:lsdException w:name="HTML Cite" w:semiHidden="1" w:unhideWhenUsed="1"/>
+    <w:lsdException w:name="HTML Code" w:semiHidden="1" w:unhideWhenUsed="1"/>
+    <w:lsdException w:name="HTML Definition" w:semiHidden="1" w:unhideWhenUsed="1"/>
+    <w:lsdException w:name="HTML Keyboard" w:semiHidden="1" w:unhideWhenUsed="1"/>
+    <w:lsdException w:name="HTML Preformatted" w:semiHidden="1" w:unhideWhenUsed="1"/>
+    <w:lsdException w:name="HTML Sample" w:semiHidden="1" w:unhideWhenUsed="1"/>
+    <w:lsdException w:name="HTML Typewriter" w:semiHidden="1" w:unhideWhenUsed="1"/>
+    <w:lsdException w:name="HTML Variable" w:semiHidden="1" w:unhideWhenUsed="1"/>
+    <w:lsdException w:name="Normal Table" w:semiHidden="1" w:unhideWhenUsed="1"/>
+    <w:lsdException w:name="annotation subject" w:semiHidden="1" w:unhideWhenUsed="1"/>
+    <w:lsdException w:name="No List" w:semiHidden="1" w:unhideWhenUsed="1"/>
+    <w:lsdException w:name="Outline List 1" w:semiHidden="1" w:unhideWhenUsed="1"/>
+    <w:lsdException w:name="Outline List 2" w:semiHidden="1" w:unhideWhenUsed="1"/>
+    <w:lsdException w:name="Outline List 3" w:semiHidden="1" w:unhideWhenUsed="1"/>
+    <w:lsdException w:name="Table Simple 1" w:semiHidden="1" w:unhideWhenUsed="1"/>
+    <w:lsdException w:name="Table Simple 2" w:semiHidden="1" w:unhideWhenUsed="1"/>
+    <w:lsdException w:name="Table Simple 3" w:semiHidden="1" w:unhideWhenUsed="1"/>
+    <w:lsdException w:name="Table Classic 1" w:semiHidden="1" w:unhideWhenUsed="1"/>
+    <w:lsdException w:name="Table Classic 2" w:semiHidden="1" w:unhideWhenUsed="1"/>
+    <w:lsdException w:name="Table Classic 3" w:semiHidden="1" w:unhideWhenUsed="1"/>
+    <w:lsdException w:name="Table Classic 4" w:semiHidden="1" w:unhideWhenUsed="1"/>
+    <w:lsdException w:name="Table Colorful 1" w:semiHidden="1" w:unhideWhenUsed="1"/>
+    <w:lsdException w:name="Table Colorful 2" w:semiHidden="1" w:unhideWhenUsed="1"/>
+    <w:lsdException w:name="Table Colorful 3" w:semiHidden="1" w:unhideWhenUsed="1"/>
+    <w:lsdException w:name="Table Columns 1" w:semiHidden="1" w:unhideWhenUsed="1"/>
+    <w:lsdException w:name="Table Columns 2" w:semiHidden="1" w:unhideWhenUsed="1"/>
+    <w:lsdException w:name="Table Columns 3" w:semiHidden="1" w:unhideWhenUsed="1"/>
+    <w:lsdException w:name="Table Columns 4" w:semiHidden="1" w:unhideWhenUsed="1"/>
+    <w:lsdException w:name="Table Columns 5" w:semiHidden="1" w:unhideWhenUsed="1"/>
+    <w:lsdException w:name="Table Grid 1" w:semiHidden="1" w:unhideWhenUsed="1"/>
+    <w:lsdException w:name="Table Grid 2" w:semiHidden="1" w:unhideWhenUsed="1"/>
+    <w:lsdException w:name="Table Grid 3" w:semiHidden="1" w:unhideWhenUsed="1"/>
+    <w:lsdException w:name="Table Grid 4" w:semiHidden="1" w:unhideWhenUsed="1"/>
+    <w:lsdException w:name="Table Grid 5" w:semiHidden="1" w:unhideWhenUsed="1"/>
+    <w:lsdException w:name="Table Grid 6" w:semiHidden="1" w:unhideWhenUsed="1"/>
+    <w:lsdException w:name="Table Grid 7" w:semiHidden="1" w:unhideWhenUsed="1"/>
+    <w:lsdException w:name="Table Grid 8" w:semiHidden="1" w:unhideWhenUsed="1"/>
+    <w:lsdException w:name="Table List 1" w:semiHidden="1" w:unhideWhenUsed="1"/>
+    <w:lsdException w:name="Table List 2" w:semiHidden="1" w:unhideWhenUsed="1"/>
+    <w:lsdException w:name="Table List 3" w:semiHidden="1" w:unhideWhenUsed="1"/>
+    <w:lsdException w:name="Table List 4" w:semiHidden="1" w:unhideWhenUsed="1"/>
+    <w:lsdException w:name="Table List 5" w:semiHidden="1" w:unhideWhenUsed="1"/>
+    <w:lsdException w:name="Table List 6" w:semiHidden="1" w:unhideWhenUsed="1"/>
+    <w:lsdException w:name="Table List 7" w:semiHidden="1" w:unhideWhenUsed="1"/>
+    <w:lsdException w:name="Table List 8" w:semiHidden="1" w:unhideWhenUsed="1"/>
+    <w:lsdException w:name="Table 3D effects 1" w:semiHidden="1" w:unhideWhenUsed="1"/>
+    <w:lsdException w:name="Table 3D effects 2" w:semiHidden="1" w:unhideWhenUsed="1"/>
+    <w:lsdException w:name="Table 3D effects 3" w:semiHidden="1" w:unhideWhenUsed="1"/>
+    <w:lsdException w:name="Table Contemporary" w:semiHidden="1" w:unhideWhenUsed="1"/>
+    <w:lsdException w:name="Table Elegant" w:semiHidden="1" w:unhideWhenUsed="1"/>
+    <w:lsdException w:name="Table Professional" w:semiHidden="1" w:unhideWhenUsed="1"/>
+    <w:lsdException w:name="Table Subtle 1" w:semiHidden="1" w:unhideWhenUsed="1"/>
+    <w:lsdException w:name="Table Subtle 2" w:semiHidden="1" w:unhideWhenUsed="1"/>
+    <w:lsdException w:name="Table Web 1" w:semiHidden="1" w:unhideWhenUsed="1"/>
+    <w:lsdException w:name="Table Web 2" w:semiHidden="1" w:unhideWhenUsed="1"/>
+    <w:lsdException w:name="Table Web 3" w:semiHidden="1" w:unhideWhenUsed="1"/>
+    <w:lsdException w:name="Balloon Text" w:semiHidden="1" w:unhideWhenUsed="1"/>
+    <w:lsdException w:name="Table Grid" w:uiPriority="59"/>
+    <w:lsdException w:name="Table Theme" w:semiHidden="1" w:unhideWhenUsed="1"/>
+    <w:lsdException w:name="Placeholder Text" w:semiHidden="1"/>
+    <w:lsdException w:name="No Spacing" w:uiPriority="1" w:qFormat="1"/>
+    <w:lsdException w:name="Light Shading" w:uiPriority="60"/>
+    <w:lsdException w:name="Light List" w:uiPriority="61"/>
+    <w:lsdException w:name="Light Grid" w:uiPriority="62"/>
+    <w:lsdException w:name="Medium Shading 1" w:uiPriority="63"/>
+    <w:lsdException w:name="Medium Shading 2" w:uiPriority="64"/>
+    <w:lsdException w:name="Medium List 1" w:uiPriority="65"/>
+    <w:lsdException w:name="Medium List 2" w:uiPriority="66"/>
+    <w:lsdException w:name="Medium Grid 1" w:uiPriority="67"/>
+    <w:lsdException w:name="Medium Grid 2" w:uiPriority="68"/>
+    <w:lsdException w:name="Medium Grid 3" w:uiPriority="69"/>
+    <w:lsdException w:name="Dark List" w:uiPriority="70"/>
+    <w:lsdException w:name="Colorful Shading" w:uiPriority="71"/>
+    <w:lsdException w:name="Colorful List" w:uiPriority="72"/>
+    <w:lsdException w:name="Colorful Grid" w:uiPriority="73"/>
+    <w:lsdException w:name="Light Shading Accent 1" w:uiPriority="60"/>
+    <w:lsdException w:name="Light List Accent 1" w:uiPriority="61"/>
+    <w:lsdException w:name="Light Grid Accent 1" w:uiPriority="62"/>
+    <w:lsdException w:name="Medium Shading 1 Accent 1" w:uiPriority="63"/>
+    <w:lsdException w:name="Medium Shading 2 Accent 1" w:uiPriority="64"/>
+    <w:lsdException w:name="Medium List 1 Accent 1" w:uiPriority="65"/>
+    <w:lsdException w:name="Revision" w:semiHidden="1"/>
+    <w:lsdException w:name="List Paragraph" w:uiPriority="34" w:qFormat="1"/>
+    <w:lsdException w:name="Quote" w:uiPriority="29" w:qFormat="1"/>
+    <w:lsdException w:name="Intense Quote" w:uiPriority="30" w:qFormat="1"/>
+    <w:lsdException w:name="Medium List 2 Accent 1" w:uiPriority="66"/>
+    <w:lsdException w:name="Medium Grid 1 Accent 1" w:uiPriority="67"/>
+    <w:lsdException w:name="Medium Grid 2 Accent 1" w:uiPriority="68"/>
+    <w:lsdException w:name="Medium Grid 3 Accent 1" w:uiPriority="69"/>
+    <w:lsdException w:name="Dark List Accent 1" w:uiPriority="70"/>
+    <w:lsdException w:name="Colorful Shading Accent 1" w:uiPriority="71"/>
+    <w:lsdException w:name="Colorful List Accent 1" w:uiPriority="72"/>
+    <w:lsdException w:name="Colorful Grid Accent 1" w:uiPriority="73"/>
+    <w:lsdException w:name="Light Shading Accent 2" w:uiPriority="60"/>
+    <w:lsdException w:name="Light List Accent 2" w:uiPriority="61"/>
+    <w:lsdException w:name="Light Grid Accent 2" w:uiPriority="62"/>
+    <w:lsdException w:name="Medium Shading 1 Accent 2" w:uiPriority="63"/>
+    <w:lsdException w:name="Medium Shading 2 Accent 2" w:uiPriority="64"/>
+    <w:lsdException w:name="Medium List 1 Accent 2" w:uiPriority="65"/>
+    <w:lsdException w:name="Medium List 2 Accent 2" w:uiPriority="66"/>
+    <w:lsdException w:name="Medium Grid 1 Accent 2" w:uiPriority="67"/>
+    <w:lsdException w:name="Medium Grid 2 Accent 2" w:uiPriority="68"/>
+    <w:lsdException w:name="Medium Grid 3 Accent 2" w:uiPriority="69"/>
+    <w:lsdException w:name="Dark List Accent 2" w:uiPriority="70"/>
+    <w:lsdException w:name="Colorful Shading Accent 2" w:uiPriority="71"/>
+    <w:lsdException w:name="Colorful List Accent 2" w:uiPriority="72"/>
+    <w:lsdException w:name="Colorful Grid Accent 2" w:uiPriority="73"/>
+    <w:lsdException w:name="Light Shading Accent 3" w:uiPriority="60"/>
+    <w:lsdException w:name="Light List Accent 3" w:uiPriority="61"/>
+    <w:lsdException w:name="Light Grid Accent 3" w:uiPriority="62"/>
+    <w:lsdException w:name="Medium Shading 1 Accent 3" w:uiPriority="63"/>
+    <w:lsdException w:name="Medium Shading 2 Accent 3" w:uiPriority="64"/>
+    <w:lsdException w:name="Medium List 1 Accent 3" w:uiPriority="65"/>
+    <w:lsdException w:name="Medium List 2 Accent 3" w:uiPriority="66"/>
+    <w:lsdException w:name="Medium Grid 1 Accent 3" w:uiPriority="67"/>
+    <w:lsdException w:name="Medium Grid 2 Accent 3" w:uiPriority="68"/>
+    <w:lsdException w:name="Medium Grid 3 Accent 3" w:uiPriority="69"/>
+    <w:lsdException w:name="Dark List Accent 3" w:uiPriority="70"/>
+    <w:lsdException w:name="Colorful Shading Accent 3" w:uiPriority="71"/>
+    <w:lsdException w:name="Colorful List Accent 3" w:uiPriority="72"/>
+    <w:lsdException w:name="Colorful Grid Accent 3" w:uiPriority="73"/>
+    <w:lsdException w:name="Light Shading Accent 4" w:uiPriority="60"/>
+    <w:lsdException w:name="Light List Accent 4" w:uiPriority="61"/>
+    <w:lsdException w:name="Light Grid Accent 4" w:uiPriority="62"/>
+    <w:lsdException w:name="Medium Shading 1 Accent 4" w:uiPriority="63"/>
+    <w:lsdException w:name="Medium Shading 2 Accent 4" w:uiPriority="64"/>
+    <w:lsdException w:name="Medium List 1 Accent 4" w:uiPriority="65"/>
+    <w:lsdException w:name="Medium List 2 Accent 4" w:uiPriority="66"/>
+    <w:lsdException w:name="Medium Grid 1 Accent 4" w:uiPriority="67"/>
+    <w:lsdException w:name="Medium Grid 2 Accent 4" w:uiPriority="68"/>
+    <w:lsdException w:name="Medium Grid 3 Accent 4" w:uiPriority="69"/>
+    <w:lsdException w:name="Dark List Accent 4" w:uiPriority="70"/>
+    <w:lsdException w:name="Colorful Shading Accent 4" w:uiPriority="71"/>
+    <w:lsdException w:name="Colorful List Accent 4" w:uiPriority="72"/>
+    <w:lsdException w:name="Colorful Grid Accent 4" w:uiPriority="73"/>
+    <w:lsdException w:name="Light Shading Accent 5" w:uiPriority="60"/>
+    <w:lsdException w:name="Light List Accent 5" w:uiPriority="61"/>
+    <w:lsdException w:name="Light Grid Accent 5" w:uiPriority="62"/>
+    <w:lsdException w:name="Medium Shading 1 Accent 5" w:uiPriority="63"/>
+    <w:lsdException w:name="Medium Shading 2 Accent 5" w:uiPriority="64"/>
+    <w:lsdException w:name="Medium List 1 Accent 5" w:uiPriority="65"/>
+    <w:lsdException w:name="Medium List 2 Accent 5" w:uiPriority="66"/>
+    <w:lsdException w:name="Medium Grid 1 Accent 5" w:uiPriority="67"/>
+    <w:lsdException w:name="Medium Grid 2 Accent 5" w:uiPriority="68"/>
+    <w:lsdException w:name="Medium Grid 3 Accent 5" w:uiPriority="69"/>
+    <w:lsdException w:name="Dark List Accent 5" w:uiPriority="70"/>
+    <w:lsdException w:name="Colorful Shading Accent 5" w:uiPriority="71"/>
+    <w:lsdException w:name="Colorful List Accent 5" w:uiPriority="72"/>
+    <w:lsdException w:name="Colorful Grid Accent 5" w:uiPriority="73"/>
+    <w:lsdException w:name="Light Shading Accent 6" w:uiPriority="60"/>
+    <w:lsdException w:name="Light List Accent 6" w:uiPriority="61"/>
+    <w:lsdException w:name="Light Grid Accent 6" w:uiPriority="62"/>
+    <w:lsdException w:name="Medium Shading 1 Accent 6" w:uiPriority="63"/>
+    <w:lsdException w:name="Medium Shading 2 Accent 6" w:uiPriority="64"/>
+    <w:lsdException w:name="Medium List 1 Accent 6" w:uiPriority="65"/>
+    <w:lsdException w:name="Medium List 2 Accent 6" w:uiPriority="66"/>
+    <w:lsdException w:name="Medium Grid 1 Accent 6" w:uiPriority="67"/>
+    <w:lsdException w:name="Medium Grid 2 Accent 6" w:uiPriority="68"/>
+    <w:lsdException w:name="Medium Grid 3 Accent 6" w:uiPriority="69"/>
+    <w:lsdException w:name="Dark List Accent 6" w:uiPriority="70"/>
+    <w:lsdException w:name="Colorful Shading Accent 6" w:uiPriority="71"/>
+    <w:lsdException w:name="Colorful List Accent 6" w:uiPriority="72"/>
+    <w:lsdException w:name="Colorful Grid Accent 6" w:uiPriority="73"/>
+    <w:lsdException w:name="Subtle Emphasis" w:uiPriority="19" w:qFormat="1"/>
+    <w:lsdException w:name="Intense Emphasis" w:uiPriority="21" w:qFormat="1"/>
+    <w:lsdException w:name="Subtle Reference" w:uiPriority="31" w:qFormat="1"/>
+    <w:lsdException w:name="Intense Reference" w:uiPriority="32" w:qFormat="1"/>
+    <w:lsdException w:name="Book Title" w:uiPriority="33" w:qFormat="1"/>
+    <w:lsdException w:name="Bibliography" w:semiHidden="1" w:uiPriority="37" w:unhideWhenUsed="1"/>
+    <w:lsdException w:name="TOC Heading" w:semiHidden="1" w:uiPriority="39" w:unhideWhenUsed="1" w:qFormat="1"/>
+    <w:lsdException w:name="Plain Table 1" w:uiPriority="41"/>
+    <w:lsdException w:name="Plain Table 2" w:uiPriority="42"/>
+    <w:lsdException w:name="Plain Table 3" w:uiPriority="43"/>
+    <w:lsdException w:name="Plain Table 4" w:uiPriority="44"/>
+    <w:lsdException w:name="Plain Table 5" w:uiPriority="45"/>
+    <w:lsdException w:name="Grid Table Light" w:uiPriority="40"/>
+    <w:lsdException w:name="Grid Table 1 Light" w:uiPriority="46"/>
+    <w:lsdException w:name="Grid Table 2" w:uiPriority="47"/>
+    <w:lsdException w:name="Grid Table 3" w:uiPriority="48"/>
+    <w:lsdException w:name="Grid Table 4" w:uiPriority="49"/>
+    <w:lsdException w:name="Grid Table 5 Dark" w:uiPriority="50"/>
+    <w:lsdException w:name="Grid Table 6 Colorful" w:uiPriority="51"/>
+    <w:lsdException w:name="Grid Table 7 Colorful" w:uiPriority="52"/>
+    <w:lsdException w:name="Grid Table 1 Light Accent 1" w:uiPriority="46"/>
+    <w:lsdException w:name="Grid Table 2 Accent 1" w:uiPriority="47"/>
+    <w:lsdException w:name="Grid Table 3 Accent 1" w:uiPriority="48"/>
+    <w:lsdException w:name="Grid Table 4 Accent 1" w:uiPriority="49"/>
+    <w:lsdException w:name="Grid Table 5 Dark Accent 1" w:uiPriority="50"/>
+    <w:lsdException w:name="Grid Table 6 Colorful Accent 1" w:uiPriority="51"/>
+    <w:lsdException w:name="Grid Table 7 Colorful Accent 1" w:uiPriority="52"/>
+    <w:lsdException w:name="Grid Table 1 Light Accent 2" w:uiPriority="46"/>
+    <w:lsdException w:name="Grid Table 2 Accent 2" w:uiPriority="47"/>
+    <w:lsdException w:name="Grid Table 3 Accent 2" w:uiPriority="48"/>
+    <w:lsdException w:name="Grid Table 4 Accent 2" w:uiPriority="49"/>
+    <w:lsdException w:name="Grid Table 5 Dark Accent 2" w:uiPriority="50"/>
+    <w:lsdException w:name="Grid Table 6 Colorful Accent 2" w:uiPriority="51"/>
+    <w:lsdException w:name="Grid Table 7 Colorful Accent 2" w:uiPriority="52"/>
+    <w:lsdException w:name="Grid Table 1 Light Accent 3" w:uiPriority="46"/>
+    <w:lsdException w:name="Grid Table 2 Accent 3" w:uiPriority="47"/>
+    <w:lsdException w:name="Grid Table 3 Accent 3" w:uiPriority="48"/>
+    <w:lsdException w:name="Grid Table 4 Accent 3" w:uiPriority="49"/>
+    <w:lsdException w:name="Grid Table 5 Dark Accent 3" w:uiPriority="50"/>
+    <w:lsdException w:name="Grid Table 6 Colorful Accent 3" w:uiPriority="51"/>
+    <w:lsdException w:name="Grid Table 7 Colorful Accent 3" w:uiPriority="52"/>
+    <w:lsdException w:name="Grid Table 1 Light Accent 4" w:uiPriority="46"/>
+    <w:lsdException w:name="Grid Table 2 Accent 4" w:uiPriority="47"/>
+    <w:lsdException w:name="Grid Table 3 Accent 4" w:uiPriority="48"/>
+    <w:lsdException w:name="Grid Table 4 Accent 4" w:uiPriority="49"/>
+    <w:lsdException w:name="Grid Table 5 Dark Accent 4" w:uiPriority="50"/>
+    <w:lsdException w:name="Grid Table 6 Colorful Accent 4" w:uiPriority="51"/>
+    <w:lsdException w:name="Grid Table 7 Colorful Accent 4" w:uiPriority="52"/>
+    <w:lsdException w:name="Grid Table 1 Light Accent 5" w:uiPriority="46"/>
+    <w:lsdException w:name="Grid Table 2 Accent 5" w:uiPriority="47"/>
+    <w:lsdException w:name="Grid Table 3 Accent 5" w:uiPriority="48"/>
+    <w:lsdException w:name="Grid Table 4 Accent 5" w:uiPriority="49"/>
+    <w:lsdException w:name="Grid Table 5 Dark Accent 5" w:uiPriority="50"/>
+    <w:lsdException w:name="Grid Table 6 Colorful Accent 5" w:uiPriority="51"/>
+    <w:lsdException w:name="Grid Table 7 Colorful Accent 5" w:uiPriority="52"/>
+    <w:lsdException w:name="Grid Table 1 Light Accent 6" w:uiPriority="46"/>
+    <w:lsdException w:name="Grid Table 2 Accent 6" w:uiPriority="47"/>
+    <w:lsdException w:name="Grid Table 3 Accent 6" w:uiPriority="48"/>
+    <w:lsdException w:name="Grid Table 4 Accent 6" w:uiPriority="49"/>
+    <w:lsdException w:name="Grid Table 5 Dark Accent 6" w:uiPriority="50"/>
+    <w:lsdException w:name="Grid Table 6 Colorful Accent 6" w:uiPriority="51"/>
+    <w:lsdException w:name="Grid Table 7 Colorful Accent 6" w:uiPriority="52"/>
+    <w:lsdException w:name="List Table 1 Light" w:uiPriority="46"/>
+    <w:lsdException w:name="List Table 2" w:uiPriority="47"/>
+    <w:lsdException w:name="List Table 3" w:uiPriority="48"/>
+    <w:lsdException w:name="List Table 4" w:uiPriority="49"/>
+    <w:lsdException w:name="List Table 5 Dark" w:uiPriority="50"/>
+    <w:lsdException w:name="List Table 6 Colorful" w:uiPriority="51"/>
+    <w:lsdException w:name="List Table 7 Colorful" w:uiPriority="52"/>
+    <w:lsdException w:name="List Table 1 Light Accent 1" w:uiPriority="46"/>
+    <w:lsdException w:name="List Table 2 Accent 1" w:uiPriority="47"/>
+    <w:lsdException w:name="List Table 3 Accent 1" w:uiPriority="48"/>
+    <w:lsdException w:name="List Table 4 Accent 1" w:uiPriority="49"/>
+    <w:lsdException w:name="List Table 5 Dark Accent 1" w:uiPriority="50"/>
+    <w:lsdException w:name="List Table 6 Colorful Accent 1" w:uiPriority="51"/>
+    <w:lsdException w:name="List Table 7 Colorful Accent 1" w:uiPriority="52"/>
+    <w:lsdException w:name="List Table 1 Light Accent 2" w:uiPriority="46"/>
+    <w:lsdException w:name="List Table 2 Accent 2" w:uiPriority="47"/>
+    <w:lsdException w:name="List Table 3 Accent 2" w:uiPriority="48"/>
+    <w:lsdException w:name="List Table 4 Accent 2" w:uiPriority="49"/>
+    <w:lsdException w:name="List Table 5 Dark Accent 2" w:uiPriority="50"/>
+    <w:lsdException w:name="List Table 6 Colorful Accent 2" w:uiPriority="51"/>
+    <w:lsdException w:name="List Table 7 Colorful Accent 2" w:uiPriority="52"/>
+    <w:lsdException w:name="List Table 1 Light Accent 3" w:uiPriority="46"/>
+    <w:lsdException w:name="List Table 2 Accent 3" w:uiPriority="47"/>
+    <w:lsdException w:name="List Table 3 Accent 3" w:uiPriority="48"/>
+    <w:lsdException w:name="List Table 4 Accent 3" w:uiPriority="49"/>
+    <w:lsdException w:name="List Table 5 Dark Accent 3" w:uiPriority="50"/>
+    <w:lsdException w:name="List Table 6 Colorful Accent 3" w:uiPriority="51"/>
+    <w:lsdException w:name="List Table 7 Colorful Accent 3" w:uiPriority="52"/>
+    <w:lsdException w:name="List Table 1 Light Accent 4" w:uiPriority="46"/>
+    <w:lsdException w:name="List Table 2 Accent 4" w:uiPriority="47"/>
+    <w:lsdException w:name="List Table 3 Accent 4" w:uiPriority="48"/>
+    <w:lsdException w:name="List Table 4 Accent 4" w:uiPriority="49"/>
+    <w:lsdException w:name="List Table 5 Dark Accent 4" w:uiPriority="50"/>
+    <w:lsdException w:name="List Table 6 Colorful Accent 4" w:uiPriority="51"/>
+    <w:lsdException w:name="List Table 7 Colorful Accent 4" w:uiPriority="52"/>
+    <w:lsdException w:name="List Table 1 Light Accent 5" w:uiPriority="46"/>
+    <w:lsdException w:name="List Table 2 Accent 5" w:uiPriority="47"/>
+    <w:lsdException w:name="List Table 3 Accent 5" w:uiPriority="48"/>
+    <w:lsdException w:name="List Table 4 Accent 5" w:uiPriority="49"/>
+    <w:lsdException w:name="List Table 5 Dark Accent 5" w:uiPriority="50"/>
+    <w:lsdException w:name="List Table 6 Colorful Accent 5" w:uiPriority="51"/>
+    <w:lsdException w:name="List Table 7 Colorful Accent 5" w:uiPriority="52"/>
+    <w:lsdException w:name="List Table 1 Light Accent 6" w:uiPriority="46"/>
+    <w:lsdException w:name="List Table 2 Accent 6" w:uiPriority="47"/>
+    <w:lsdException w:name="List Table 3 Accent 6" w:uiPriority="48"/>
+    <w:lsdException w:name="List Table 4 Accent 6" w:uiPriority="49"/>
+    <w:lsdException w:name="List Table 5 Dark Accent 6" w:uiPriority="50"/>
+    <w:lsdException w:name="List Table 6 Colorful Accent 6" w:uiPriority="51"/>
+    <w:lsdException w:name="List Table 7 Colorful Accent 6" w:uiPriority="52"/>
+    <w:lsdException w:name="Mention" w:semiHidden="1" w:unhideWhenUsed="1"/>
+    <w:lsdException w:name="Smart Hyperlink" w:semiHidden="1" w:unhideWhenUsed="1"/>
+    <w:lsdException w:name="Hashtag" w:semiHidden="1" w:unhideWhenUsed="1"/>
+    <w:lsdException w:name="Unresolved Mention" w:semiHidden="1" w:unhideWhenUsed="1"/>
+    <w:lsdException w:name="Smart Link" w:semiHidden="1" w:unhideWhenUsed="1"/>
   </w:latentStyles>
   <w:style w:type="paragraph" w:default="1" w:styleId="Normal">
     <w:name w:val="Normal"/>
@@ -2521,7 +2027,6 @@
     <w:uiPriority w:val="99"/>
     <w:semiHidden/>
     <w:unhideWhenUsed/>
-    <w:qFormat/>
     <w:tblPr>
       <w:tblInd w:w="0" w:type="dxa"/>
       <w:tblCellMar>

</xml_diff>